<commit_message>
Updated the low wireframes for Proposal 1
There are now 5 different low wireframes for Proposal 1 as i have 5 different html pages
</commit_message>
<xml_diff>
--- a/WEB PART 1 .docx
+++ b/WEB PART 1 .docx
@@ -1,6 +1,6 @@
 
 <file path=word/document.xml><?xml version="1.0" encoding="utf-8"?>
-<w:document xmlns:wpc="http://schemas.microsoft.com/office/word/2010/wordprocessingCanvas" xmlns:cx="http://schemas.microsoft.com/office/drawing/2014/chartex" xmlns:cx1="http://schemas.microsoft.com/office/drawing/2015/9/8/chartex" xmlns:cx2="http://schemas.microsoft.com/office/drawing/2015/10/21/chartex" xmlns:cx3="http://schemas.microsoft.com/office/drawing/2016/5/9/chartex" xmlns:cx4="http://schemas.microsoft.com/office/drawing/2016/5/10/chartex" xmlns:cx5="http://schemas.microsoft.com/office/drawing/2016/5/11/chartex" xmlns:cx6="http://schemas.microsoft.com/office/drawing/2016/5/12/chartex" xmlns:cx7="http://schemas.microsoft.com/office/drawing/2016/5/13/chartex" xmlns:cx8="http://schemas.microsoft.com/office/drawing/2016/5/14/chartex" xmlns:mc="http://schemas.openxmlformats.org/markup-compatibility/2006" xmlns:aink="http://schemas.microsoft.com/office/drawing/2016/ink" xmlns:am3d="http://schemas.microsoft.com/office/drawing/2017/model3d" xmlns:o="urn:schemas-microsoft-com:office:office" xmlns:oel="http://schemas.microsoft.com/office/2019/extlst" xmlns:r="http://schemas.openxmlformats.org/officeDocument/2006/relationships" xmlns:m="http://schemas.openxmlformats.org/officeDocument/2006/math" xmlns:v="urn:schemas-microsoft-com:vml" xmlns:wp14="http://schemas.microsoft.com/office/word/2010/wordprocessingDrawing" xmlns:wp="http://schemas.openxmlformats.org/drawingml/2006/wordprocessingDrawing" xmlns:w10="urn:schemas-microsoft-com:office:word" xmlns:w="http://schemas.openxmlformats.org/wordprocessingml/2006/main" xmlns:w14="http://schemas.microsoft.com/office/word/2010/wordml" xmlns:w15="http://schemas.microsoft.com/office/word/2012/wordml" xmlns:w16cei="http://schemas.microsoft.com/office/word/2026/wordml/cei" xmlns:w16cex="http://schemas.microsoft.com/office/word/2018/wordml/cex" xmlns:w16cid="http://schemas.microsoft.com/office/word/2016/wordml/cid" xmlns:w16="http://schemas.microsoft.com/office/word/2018/wordml" xmlns:w16du="http://schemas.microsoft.com/office/word/2023/wordml/word16du" xmlns:w16sdtdh="http://schemas.microsoft.com/office/word/2020/wordml/sdtdatahash" xmlns:w16sdtfl="http://schemas.microsoft.com/office/word/2024/wordml/sdtformatlock" xmlns:w16se="http://schemas.microsoft.com/office/word/2015/wordml/symex" xmlns:wpg="http://schemas.microsoft.com/office/word/2010/wordprocessingGroup" xmlns:wpi="http://schemas.microsoft.com/office/word/2010/wordprocessingInk" xmlns:wne="http://schemas.microsoft.com/office/word/2006/wordml" xmlns:wps="http://schemas.microsoft.com/office/word/2010/wordprocessingShape" mc:Ignorable="w14 w15 w16se w16cid w16 w16cex w16sdtdh w16sdtfl w16du wp14">
+<w:document xmlns:wpc="http://schemas.microsoft.com/office/word/2010/wordprocessingCanvas" xmlns:cx="http://schemas.microsoft.com/office/drawing/2014/chartex" xmlns:cx1="http://schemas.microsoft.com/office/drawing/2015/9/8/chartex" xmlns:cx2="http://schemas.microsoft.com/office/drawing/2015/10/21/chartex" xmlns:cx3="http://schemas.microsoft.com/office/drawing/2016/5/9/chartex" xmlns:cx4="http://schemas.microsoft.com/office/drawing/2016/5/10/chartex" xmlns:cx5="http://schemas.microsoft.com/office/drawing/2016/5/11/chartex" xmlns:cx6="http://schemas.microsoft.com/office/drawing/2016/5/12/chartex" xmlns:cx7="http://schemas.microsoft.com/office/drawing/2016/5/13/chartex" xmlns:cx8="http://schemas.microsoft.com/office/drawing/2016/5/14/chartex" xmlns:mc="http://schemas.openxmlformats.org/markup-compatibility/2006" xmlns:aink="http://schemas.microsoft.com/office/drawing/2016/ink" xmlns:am3d="http://schemas.microsoft.com/office/drawing/2017/model3d" xmlns:o="urn:schemas-microsoft-com:office:office" xmlns:oel="http://schemas.microsoft.com/office/2019/extlst" xmlns:r="http://schemas.openxmlformats.org/officeDocument/2006/relationships" xmlns:m="http://schemas.openxmlformats.org/officeDocument/2006/math" xmlns:v="urn:schemas-microsoft-com:vml" xmlns:wp14="http://schemas.microsoft.com/office/word/2010/wordprocessingDrawing" xmlns:wp="http://schemas.openxmlformats.org/drawingml/2006/wordprocessingDrawing" xmlns:w10="urn:schemas-microsoft-com:office:word" xmlns:w="http://schemas.openxmlformats.org/wordprocessingml/2006/main" xmlns:w14="http://schemas.microsoft.com/office/word/2010/wordml" xmlns:w15="http://schemas.microsoft.com/office/word/2012/wordml" xmlns:w16cei="http://schemas.microsoft.com/office/word/2026/wordml/cei" xmlns:w16cex="http://schemas.microsoft.com/office/word/2018/wordml/cex" xmlns:w16cid="http://schemas.microsoft.com/office/word/2016/wordml/cid" xmlns:w16="http://schemas.microsoft.com/office/word/2018/wordml" xmlns:w16du="http://schemas.microsoft.com/office/word/2023/wordml/word16du" xmlns:w16sdtdh="http://schemas.microsoft.com/office/word/2020/wordml/sdtdatahash" xmlns:w16sdtfl="http://schemas.microsoft.com/office/word/2024/wordml/sdtformatlock" xmlns:w16se="http://schemas.microsoft.com/office/word/2015/wordml/symex" xmlns:wpg="http://schemas.microsoft.com/office/word/2010/wordprocessingGroup" xmlns:wpi="http://schemas.microsoft.com/office/word/2010/wordprocessingInk" xmlns:wne="http://schemas.microsoft.com/office/word/2006/wordml" xmlns:wps="http://schemas.microsoft.com/office/word/2010/wordprocessingShape" xmlns:a="http://schemas.openxmlformats.org/drawingml/2006/main" xmlns:pic="http://schemas.openxmlformats.org/drawingml/2006/picture" mc:Ignorable="w14 w15 w16se w16cid w16 w16cex w16sdtdh w16sdtfl w16du wp14">
   <w:body>
     <w:sdt>
       <w:sdtPr>
@@ -10,6 +10,7 @@
           <w:docPartUnique/>
         </w:docPartObj>
       </w:sdtPr>
+      <w:sdtEndPr/>
       <w:sdtContent>
         <w:p>
           <w:pPr>
@@ -223,7 +224,7 @@
                                 <a:avLst/>
                               </a:prstGeom>
                               <a:blipFill>
-                                <a:blip r:embed="rId7"/>
+                                <a:blip r:embed="rId10"/>
                                 <a:stretch>
                                   <a:fillRect r="-7574"/>
                                 </a:stretch>
@@ -268,14 +269,14 @@
                 </w:drawing>
               </mc:Choice>
               <mc:Fallback>
-                <w:pict>
-                  <v:group w14:anchorId="035308A1" id="Group 157" o:spid="_x0000_s1026" style="position:absolute;margin-left:0;margin-top:0;width:8in;height:95.7pt;z-index:251662336;mso-width-percent:941;mso-height-percent:121;mso-top-percent:23;mso-position-horizontal:center;mso-position-horizontal-relative:page;mso-position-vertical-relative:page;mso-width-percent:941;mso-height-percent:121;mso-top-percent:23" coordorigin="" coordsize="73152,12161" o:gfxdata="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">
-                    <v:shape id="Rectangle 51" o:spid="_x0000_s1027" style="position:absolute;width:73152;height:11303;visibility:visible;mso-wrap-style:square;v-text-anchor:middle" coordsize="7312660,1129665" o:gfxdata="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" path="m,l7312660,r,1129665l3619500,733425,,1091565,,xe" fillcolor="#156082 [3204]" stroked="f" strokeweight="1.5pt">
+                <w:pict w14:anchorId="18161B27">
+                  <v:group id="Group 157" style="position:absolute;margin-left:0;margin-top:0;width:8in;height:95.7pt;z-index:251662336;mso-width-percent:941;mso-height-percent:121;mso-top-percent:23;mso-position-horizontal:center;mso-position-horizontal-relative:page;mso-position-vertical-relative:page;mso-width-percent:941;mso-height-percent:121;mso-top-percent:23" coordsize="73152,12161" coordorigin="" o:spid="_x0000_s1026" w14:anchorId="2FAEA709" o:gfxdata="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">
+                    <v:shape id="Rectangle 51" style="position:absolute;width:73152;height:11303;visibility:visible;mso-wrap-style:square;v-text-anchor:middle" coordsize="7312660,1129665" o:spid="_x0000_s1027" fillcolor="#156082 [3204]" stroked="f" strokeweight="1.5pt" path="m,l7312660,r,1129665l3619500,733425,,1091565,,xe" o:gfxdata="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">
                       <v:stroke joinstyle="miter"/>
                       <v:path arrowok="t" o:connecttype="custom" o:connectlocs="0,0;7315200,0;7315200,1130373;3620757,733885;0,1092249;0,0" o:connectangles="0,0,0,0,0,0"/>
                     </v:shape>
-                    <v:rect id="Rectangle 151" o:spid="_x0000_s1028" style="position:absolute;width:73152;height:12161;visibility:visible;mso-wrap-style:square;v-text-anchor:middle" o:gfxdata="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" stroked="f" strokeweight="1.5pt">
-                      <v:fill r:id="rId8" o:title="" recolor="t" rotate="t" type="frame"/>
+                    <v:rect id="Rectangle 151" style="position:absolute;width:73152;height:12161;visibility:visible;mso-wrap-style:square;v-text-anchor:middle" o:spid="_x0000_s1028" stroked="f" strokeweight="1.5pt" o:gfxdata="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">
+                      <v:fill type="frame" o:title="" recolor="t" rotate="t" r:id="rId11"/>
                     </v:rect>
                     <w10:wrap anchorx="page" anchory="page"/>
                   </v:group>
@@ -359,6 +360,7 @@
                                   <w:dataBinding w:prefixMappings="xmlns:ns0='http://purl.org/dc/elements/1.1/' xmlns:ns1='http://schemas.openxmlformats.org/package/2006/metadata/core-properties' " w:xpath="/ns1:coreProperties[1]/ns0:creator[1]" w:storeItemID="{6C3C8BC8-F283-45AE-878A-BAB7291924A1}"/>
                                   <w:text/>
                                 </w:sdtPr>
+                                <w:sdtEndPr/>
                                 <w:sdtContent>
                                   <w:p>
                                     <w:pPr>
@@ -404,6 +406,7 @@
                                     <w:dataBinding w:prefixMappings="xmlns:ns0='http://schemas.microsoft.com/office/2006/coverPageProps' " w:xpath="/ns0:CoverPageProperties[1]/ns0:CompanyEmail[1]" w:storeItemID="{55AF091B-3C7A-41E3-B477-F2FDAA23CFDA}"/>
                                     <w:text/>
                                   </w:sdtPr>
+                                  <w:sdtEndPr/>
                                   <w:sdtContent>
                                     <w:r>
                                       <w:rPr>
@@ -437,16 +440,17 @@
                 </w:drawing>
               </mc:Choice>
               <mc:Fallback>
-                <w:pict>
-                  <v:shapetype w14:anchorId="0FFD2DED" id="_x0000_t202" coordsize="21600,21600" o:spt="202" path="m,l,21600r21600,l21600,xe">
+                <w:pict w14:anchorId="657428B3">
+                  <v:shapetype id="_x0000_t202" coordsize="21600,21600" o:spt="202" path="m,l,21600r21600,l21600,xe" w14:anchorId="0FFD2DED">
                     <v:stroke joinstyle="miter"/>
                     <v:path gradientshapeok="t" o:connecttype="rect"/>
                   </v:shapetype>
-                  <v:shape id="Text Box 159" o:spid="_x0000_s1026" type="#_x0000_t202" style="position:absolute;margin-left:0;margin-top:0;width:8in;height:1in;z-index:251660288;visibility:visible;mso-wrap-style:square;mso-width-percent:941;mso-height-percent:92;mso-top-percent:818;mso-wrap-distance-left:9pt;mso-wrap-distance-top:0;mso-wrap-distance-right:9pt;mso-wrap-distance-bottom:0;mso-position-horizontal:center;mso-position-horizontal-relative:page;mso-position-vertical-relative:page;mso-width-percent:941;mso-height-percent:92;mso-top-percent:818;mso-width-relative:page;mso-height-relative:page;v-text-anchor:bottom" o:gfxdata="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" filled="f" stroked="f" strokeweight=".5pt">
+                  <v:shape id="Text Box 159" style="position:absolute;margin-left:0;margin-top:0;width:8in;height:1in;z-index:251660288;visibility:visible;mso-wrap-style:square;mso-width-percent:941;mso-height-percent:92;mso-top-percent:818;mso-wrap-distance-left:9pt;mso-wrap-distance-top:0;mso-wrap-distance-right:9pt;mso-wrap-distance-bottom:0;mso-position-horizontal:center;mso-position-horizontal-relative:page;mso-position-vertical-relative:page;mso-width-percent:941;mso-height-percent:92;mso-top-percent:818;mso-width-relative:page;mso-height-relative:page;v-text-anchor:bottom" o:spid="_x0000_s1026" filled="f" stroked="f" strokeweight=".5pt" type="#_x0000_t202" o:gfxdata="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">
                     <v:textbox inset="126pt,0,54pt,0">
                       <w:txbxContent>
                         <w:sdt>
                           <w:sdtPr>
+                            <w:id w:val="1286699501"/>
                             <w:rPr>
                               <w:color w:val="595959" w:themeColor="text1" w:themeTint="A6"/>
                               <w:sz w:val="28"/>
@@ -458,6 +462,7 @@
                             <w:dataBinding w:prefixMappings="xmlns:ns0='http://purl.org/dc/elements/1.1/' xmlns:ns1='http://schemas.openxmlformats.org/package/2006/metadata/core-properties' " w:xpath="/ns1:coreProperties[1]/ns0:creator[1]" w:storeItemID="{6C3C8BC8-F283-45AE-878A-BAB7291924A1}"/>
                             <w:text/>
                           </w:sdtPr>
+                          <w:sdtEndPr/>
                           <w:sdtContent>
                             <w:p>
                               <w:pPr>
@@ -492,6 +497,7 @@
                           </w:pPr>
                           <w:sdt>
                             <w:sdtPr>
+                              <w:id w:val="1238913514"/>
                               <w:rPr>
                                 <w:color w:val="595959" w:themeColor="text1" w:themeTint="A6"/>
                                 <w:sz w:val="18"/>
@@ -503,6 +509,7 @@
                               <w:dataBinding w:prefixMappings="xmlns:ns0='http://schemas.microsoft.com/office/2006/coverPageProps' " w:xpath="/ns0:CoverPageProperties[1]/ns0:CompanyEmail[1]" w:storeItemID="{55AF091B-3C7A-41E3-B477-F2FDAA23CFDA}"/>
                               <w:text/>
                             </w:sdtPr>
+                            <w:sdtEndPr/>
                             <w:sdtContent>
                               <w:r>
                                 <w:rPr>
@@ -598,7 +605,7 @@
                                 </w:pPr>
                                 <w:r>
                                   <w:rPr>
-                                    <w:rFonts w:asciiTheme="majorHAnsi" w:eastAsiaTheme="majorEastAsia" w:hAnsiTheme="majorHAnsi" w:cstheme="majorBidi"/>
+                                    <w:rFonts w:asciiTheme="majorHAnsi" w:hAnsiTheme="majorHAnsi" w:eastAsiaTheme="majorEastAsia" w:cstheme="majorBidi"/>
                                     <w:noProof/>
                                     <w:color w:val="0E2841" w:themeColor="text2"/>
                                     <w:sz w:val="32"/>
@@ -620,6 +627,7 @@
                                   <w:dataBinding w:prefixMappings="xmlns:ns0='http://schemas.microsoft.com/office/2006/coverPageProps' " w:xpath="/ns0:CoverPageProperties[1]/ns0:Abstract[1]" w:storeItemID="{55AF091B-3C7A-41E3-B477-F2FDAA23CFDA}"/>
                                   <w:text w:multiLine="1"/>
                                 </w:sdtPr>
+                                <w:sdtEndPr/>
                                 <w:sdtContent>
                                   <w:p>
                                     <w:pPr>
@@ -663,8 +671,8 @@
                 </w:drawing>
               </mc:Choice>
               <mc:Fallback>
-                <w:pict>
-                  <v:shape w14:anchorId="2D1A5CDD" id="Text Box 161" o:spid="_x0000_s1027" type="#_x0000_t202" style="position:absolute;margin-left:0;margin-top:0;width:8in;height:79.5pt;z-index:251661312;visibility:visible;mso-wrap-style:square;mso-width-percent:941;mso-height-percent:100;mso-top-percent:700;mso-wrap-distance-left:9pt;mso-wrap-distance-top:0;mso-wrap-distance-right:9pt;mso-wrap-distance-bottom:0;mso-position-horizontal:center;mso-position-horizontal-relative:page;mso-position-vertical-relative:page;mso-width-percent:941;mso-height-percent:100;mso-top-percent:700;mso-width-relative:page;mso-height-relative:page;v-text-anchor:top" o:gfxdata="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" filled="f" stroked="f" strokeweight=".5pt">
+                <w:pict w14:anchorId="7D2DAB5A">
+                  <v:shape id="Text Box 161" style="position:absolute;margin-left:0;margin-top:0;width:8in;height:79.5pt;z-index:251661312;visibility:visible;mso-wrap-style:square;mso-width-percent:941;mso-height-percent:100;mso-top-percent:700;mso-wrap-distance-left:9pt;mso-wrap-distance-top:0;mso-wrap-distance-right:9pt;mso-wrap-distance-bottom:0;mso-position-horizontal:center;mso-position-horizontal-relative:page;mso-position-vertical-relative:page;mso-width-percent:941;mso-height-percent:100;mso-top-percent:700;mso-width-relative:page;mso-height-relative:page;v-text-anchor:top" o:spid="_x0000_s1027" filled="f" stroked="f" strokeweight=".5pt" type="#_x0000_t202" o:gfxdata="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" w14:anchorId="2D1A5CDD">
                     <v:textbox style="mso-fit-shape-to-text:t" inset="126pt,0,54pt,0">
                       <w:txbxContent>
                         <w:p>
@@ -679,7 +687,7 @@
                           </w:pPr>
                           <w:r>
                             <w:rPr>
-                              <w:rFonts w:asciiTheme="majorHAnsi" w:eastAsiaTheme="majorEastAsia" w:hAnsiTheme="majorHAnsi" w:cstheme="majorBidi"/>
+                              <w:rFonts w:asciiTheme="majorHAnsi" w:hAnsiTheme="majorHAnsi" w:eastAsiaTheme="majorEastAsia" w:cstheme="majorBidi"/>
                               <w:noProof/>
                               <w:color w:val="0E2841" w:themeColor="text2"/>
                               <w:sz w:val="32"/>
@@ -690,6 +698,7 @@
                         </w:p>
                         <w:sdt>
                           <w:sdtPr>
+                            <w:id w:val="193387309"/>
                             <w:rPr>
                               <w:color w:val="595959" w:themeColor="text1" w:themeTint="A6"/>
                               <w:sz w:val="20"/>
@@ -701,6 +710,7 @@
                             <w:dataBinding w:prefixMappings="xmlns:ns0='http://schemas.microsoft.com/office/2006/coverPageProps' " w:xpath="/ns0:CoverPageProperties[1]/ns0:Abstract[1]" w:storeItemID="{55AF091B-3C7A-41E3-B477-F2FDAA23CFDA}"/>
                             <w:text w:multiLine="1"/>
                           </w:sdtPr>
+                          <w:sdtEndPr/>
                           <w:sdtContent>
                             <w:p>
                               <w:pPr>
@@ -848,6 +858,7 @@
                                   <w:dataBinding w:prefixMappings="xmlns:ns0='http://purl.org/dc/elements/1.1/' xmlns:ns1='http://schemas.openxmlformats.org/package/2006/metadata/core-properties' " w:xpath="/ns1:coreProperties[1]/ns0:subject[1]" w:storeItemID="{6C3C8BC8-F283-45AE-878A-BAB7291924A1}"/>
                                   <w:text/>
                                 </w:sdtPr>
+                                <w:sdtEndPr/>
                                 <w:sdtContent>
                                   <w:p>
                                     <w:pPr>
@@ -891,8 +902,8 @@
                 </w:drawing>
               </mc:Choice>
               <mc:Fallback>
-                <w:pict>
-                  <v:shape w14:anchorId="4DE5D751" id="Text Box 163" o:spid="_x0000_s1028" type="#_x0000_t202" style="position:absolute;margin-left:0;margin-top:0;width:8in;height:286.5pt;z-index:251659264;visibility:visible;mso-wrap-style:square;mso-width-percent:941;mso-height-percent:363;mso-top-percent:300;mso-wrap-distance-left:9pt;mso-wrap-distance-top:0;mso-wrap-distance-right:9pt;mso-wrap-distance-bottom:0;mso-position-horizontal:center;mso-position-horizontal-relative:page;mso-position-vertical-relative:page;mso-width-percent:941;mso-height-percent:363;mso-top-percent:300;mso-width-relative:page;mso-height-relative:page;v-text-anchor:bottom" o:gfxdata="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" filled="f" stroked="f" strokeweight=".5pt">
+                <w:pict w14:anchorId="4B09D0FE">
+                  <v:shape id="Text Box 163" style="position:absolute;margin-left:0;margin-top:0;width:8in;height:286.5pt;z-index:251659264;visibility:visible;mso-wrap-style:square;mso-width-percent:941;mso-height-percent:363;mso-top-percent:300;mso-wrap-distance-left:9pt;mso-wrap-distance-top:0;mso-wrap-distance-right:9pt;mso-wrap-distance-bottom:0;mso-position-horizontal:center;mso-position-horizontal-relative:page;mso-position-vertical-relative:page;mso-width-percent:941;mso-height-percent:363;mso-top-percent:300;mso-width-relative:page;mso-height-relative:page;v-text-anchor:bottom" o:spid="_x0000_s1028" filled="f" stroked="f" strokeweight=".5pt" type="#_x0000_t202" o:gfxdata="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" w14:anchorId="4DE5D751">
                     <v:textbox inset="126pt,0,54pt,0">
                       <w:txbxContent>
                         <w:p>
@@ -906,6 +917,7 @@
                           </w:pPr>
                           <w:sdt>
                             <w:sdtPr>
+                              <w:id w:val="1637137749"/>
                               <w:rPr>
                                 <w:caps/>
                                 <w:color w:val="156082" w:themeColor="accent1"/>
@@ -938,6 +950,7 @@
                         </w:p>
                         <w:sdt>
                           <w:sdtPr>
+                            <w:id w:val="377999555"/>
                             <w:rPr>
                               <w:color w:val="404040" w:themeColor="text1" w:themeTint="BF"/>
                               <w:sz w:val="36"/>
@@ -949,6 +962,7 @@
                             <w:dataBinding w:prefixMappings="xmlns:ns0='http://purl.org/dc/elements/1.1/' xmlns:ns1='http://schemas.openxmlformats.org/package/2006/metadata/core-properties' " w:xpath="/ns1:coreProperties[1]/ns0:subject[1]" w:storeItemID="{6C3C8BC8-F283-45AE-878A-BAB7291924A1}"/>
                             <w:text/>
                           </w:sdtPr>
+                          <w:sdtEndPr/>
                           <w:sdtContent>
                             <w:p>
                               <w:pPr>
@@ -997,19 +1011,26 @@
           <w:docPartGallery w:val="Table of Contents"/>
           <w:docPartUnique/>
         </w:docPartObj>
-      </w:sdtPr>
-      <w:sdtEndPr>
-        <w:rPr>
-          <w:rFonts w:asciiTheme="minorHAnsi" w:eastAsiaTheme="minorHAnsi" w:hAnsiTheme="minorHAnsi" w:cstheme="minorBidi"/>
-          <w:b/>
-          <w:bCs/>
-          <w:noProof/>
+        <w:rPr>
+          <w:rFonts w:ascii="Aptos" w:hAnsi="Aptos" w:eastAsia="Aptos" w:cs="" w:asciiTheme="minorAscii" w:hAnsiTheme="minorAscii" w:eastAsiaTheme="minorAscii" w:cstheme="minorBidi"/>
           <w:color w:val="auto"/>
           <w:kern w:val="2"/>
           <w:sz w:val="24"/>
           <w:szCs w:val="24"/>
           <w:lang w:val="en-ZA"/>
           <w14:ligatures w14:val="standardContextual"/>
+        </w:rPr>
+      </w:sdtPr>
+      <w:sdtEndPr>
+        <w:rPr>
+          <w:rFonts w:ascii="Aptos" w:hAnsi="Aptos" w:eastAsia="Aptos" w:cs="" w:asciiTheme="minorAscii" w:hAnsiTheme="minorAscii" w:eastAsiaTheme="minorAscii" w:cstheme="minorBidi"/>
+          <w:b w:val="1"/>
+          <w:bCs w:val="1"/>
+          <w:noProof/>
+          <w:color w:val="auto"/>
+          <w:sz w:val="24"/>
+          <w:szCs w:val="24"/>
+          <w:lang w:val="en-ZA"/>
         </w:rPr>
       </w:sdtEndPr>
       <w:sdtContent>
@@ -1042,7 +1063,7 @@
           <w:r>
             <w:fldChar w:fldCharType="separate"/>
           </w:r>
-          <w:hyperlink w:anchor="_Toc237022774" w:history="1">
+          <w:hyperlink w:history="1" w:anchor="_Toc237022774">
             <w:r>
               <w:rPr>
                 <w:rStyle w:val="Hyperlink"/>
@@ -1111,7 +1132,7 @@
               <w:noProof/>
             </w:rPr>
           </w:pPr>
-          <w:hyperlink w:anchor="_Toc237022775" w:history="1">
+          <w:hyperlink w:history="1" w:anchor="_Toc237022775">
             <w:r>
               <w:rPr>
                 <w:rStyle w:val="Hyperlink"/>
@@ -1196,7 +1217,7 @@
               <w:noProof/>
             </w:rPr>
           </w:pPr>
-          <w:hyperlink w:anchor="_Toc237022776" w:history="1">
+          <w:hyperlink w:history="1" w:anchor="_Toc237022776">
             <w:r>
               <w:rPr>
                 <w:rStyle w:val="Hyperlink"/>
@@ -1265,7 +1286,7 @@
               <w:noProof/>
             </w:rPr>
           </w:pPr>
-          <w:hyperlink w:anchor="_Toc237022777" w:history="1">
+          <w:hyperlink w:history="1" w:anchor="_Toc237022777">
             <w:r>
               <w:rPr>
                 <w:rStyle w:val="Hyperlink"/>
@@ -1334,7 +1355,7 @@
               <w:noProof/>
             </w:rPr>
           </w:pPr>
-          <w:hyperlink w:anchor="_Toc237022778" w:history="1">
+          <w:hyperlink w:history="1" w:anchor="_Toc237022778">
             <w:r>
               <w:rPr>
                 <w:rStyle w:val="Hyperlink"/>
@@ -1403,7 +1424,7 @@
               <w:noProof/>
             </w:rPr>
           </w:pPr>
-          <w:hyperlink w:anchor="_Toc237022779" w:history="1">
+          <w:hyperlink w:history="1" w:anchor="_Toc237022779">
             <w:r>
               <w:rPr>
                 <w:rStyle w:val="Hyperlink"/>
@@ -1472,7 +1493,7 @@
               <w:noProof/>
             </w:rPr>
           </w:pPr>
-          <w:hyperlink w:anchor="_Toc237022780" w:history="1">
+          <w:hyperlink w:history="1" w:anchor="_Toc237022780">
             <w:r>
               <w:rPr>
                 <w:rStyle w:val="Hyperlink"/>
@@ -1541,7 +1562,7 @@
               <w:noProof/>
             </w:rPr>
           </w:pPr>
-          <w:hyperlink w:anchor="_Toc237022781" w:history="1">
+          <w:hyperlink w:history="1" w:anchor="_Toc237022781">
             <w:r>
               <w:rPr>
                 <w:rStyle w:val="Hyperlink"/>
@@ -1610,7 +1631,7 @@
               <w:noProof/>
             </w:rPr>
           </w:pPr>
-          <w:hyperlink w:anchor="_Toc237022782" w:history="1">
+          <w:hyperlink w:history="1" w:anchor="_Toc237022782">
             <w:r>
               <w:rPr>
                 <w:rStyle w:val="Hyperlink"/>
@@ -1679,7 +1700,7 @@
               <w:noProof/>
             </w:rPr>
           </w:pPr>
-          <w:hyperlink w:anchor="_Toc237022783" w:history="1">
+          <w:hyperlink w:history="1" w:anchor="_Toc237022783">
             <w:r>
               <w:rPr>
                 <w:rStyle w:val="Hyperlink"/>
@@ -1748,7 +1769,7 @@
               <w:noProof/>
             </w:rPr>
           </w:pPr>
-          <w:hyperlink w:anchor="_Toc237022784" w:history="1">
+          <w:hyperlink w:history="1" w:anchor="_Toc237022784">
             <w:r>
               <w:rPr>
                 <w:rStyle w:val="Hyperlink"/>
@@ -1817,7 +1838,7 @@
               <w:noProof/>
             </w:rPr>
           </w:pPr>
-          <w:hyperlink w:anchor="_Toc237022785" w:history="1">
+          <w:hyperlink w:history="1" w:anchor="_Toc237022785">
             <w:r>
               <w:rPr>
                 <w:rStyle w:val="Hyperlink"/>
@@ -1886,7 +1907,7 @@
               <w:noProof/>
             </w:rPr>
           </w:pPr>
-          <w:hyperlink w:anchor="_Toc237022786" w:history="1">
+          <w:hyperlink w:history="1" w:anchor="_Toc237022786">
             <w:r>
               <w:rPr>
                 <w:rStyle w:val="Hyperlink"/>
@@ -1955,7 +1976,7 @@
               <w:noProof/>
             </w:rPr>
           </w:pPr>
-          <w:hyperlink w:anchor="_Toc237022787" w:history="1">
+          <w:hyperlink w:history="1" w:anchor="_Toc237022787">
             <w:r>
               <w:rPr>
                 <w:rStyle w:val="Hyperlink"/>
@@ -2024,7 +2045,7 @@
               <w:noProof/>
             </w:rPr>
           </w:pPr>
-          <w:hyperlink w:anchor="_Toc237022788" w:history="1">
+          <w:hyperlink w:history="1" w:anchor="_Toc237022788">
             <w:r>
               <w:rPr>
                 <w:rStyle w:val="Hyperlink"/>
@@ -2093,7 +2114,7 @@
               <w:noProof/>
             </w:rPr>
           </w:pPr>
-          <w:hyperlink w:anchor="_Toc237022789" w:history="1">
+          <w:hyperlink w:history="1" w:anchor="_Toc237022789">
             <w:r>
               <w:rPr>
                 <w:rStyle w:val="Hyperlink"/>
@@ -2162,7 +2183,7 @@
               <w:noProof/>
             </w:rPr>
           </w:pPr>
-          <w:hyperlink w:anchor="_Toc237022790" w:history="1">
+          <w:hyperlink w:history="1" w:anchor="_Toc237022790">
             <w:r>
               <w:rPr>
                 <w:rStyle w:val="Hyperlink"/>
@@ -2231,7 +2252,7 @@
               <w:noProof/>
             </w:rPr>
           </w:pPr>
-          <w:hyperlink w:anchor="_Toc237022791" w:history="1">
+          <w:hyperlink w:history="1" w:anchor="_Toc237022791">
             <w:r>
               <w:rPr>
                 <w:rStyle w:val="Hyperlink"/>
@@ -2301,7 +2322,7 @@
               <w:noProof/>
             </w:rPr>
           </w:pPr>
-          <w:hyperlink w:anchor="_Toc237022792" w:history="1">
+          <w:hyperlink w:history="1" w:anchor="_Toc237022792">
             <w:r>
               <w:rPr>
                 <w:rStyle w:val="Hyperlink"/>
@@ -2385,7 +2406,7 @@
               <w:noProof/>
             </w:rPr>
           </w:pPr>
-          <w:hyperlink w:anchor="_Toc237022793" w:history="1">
+          <w:hyperlink w:history="1" w:anchor="_Toc237022793">
             <w:r>
               <w:rPr>
                 <w:rStyle w:val="Hyperlink"/>
@@ -2469,7 +2490,7 @@
               <w:noProof/>
             </w:rPr>
           </w:pPr>
-          <w:hyperlink w:anchor="_Toc237022794" w:history="1">
+          <w:hyperlink w:history="1" w:anchor="_Toc237022794">
             <w:r>
               <w:rPr>
                 <w:rStyle w:val="Hyperlink"/>
@@ -2552,7 +2573,7 @@
               <w:noProof/>
             </w:rPr>
           </w:pPr>
-          <w:hyperlink w:anchor="_Toc237022795" w:history="1">
+          <w:hyperlink w:history="1" w:anchor="_Toc237022795">
             <w:r>
               <w:rPr>
                 <w:rStyle w:val="Hyperlink"/>
@@ -2621,7 +2642,7 @@
               <w:noProof/>
             </w:rPr>
           </w:pPr>
-          <w:hyperlink w:anchor="_Toc237022796" w:history="1">
+          <w:hyperlink w:history="1" w:anchor="_Toc237022796">
             <w:r>
               <w:rPr>
                 <w:rStyle w:val="Hyperlink"/>
@@ -2691,7 +2712,7 @@
               <w:noProof/>
             </w:rPr>
           </w:pPr>
-          <w:hyperlink w:anchor="_Toc237022797" w:history="1">
+          <w:hyperlink w:history="1" w:anchor="_Toc237022797">
             <w:r>
               <w:rPr>
                 <w:rStyle w:val="Hyperlink"/>
@@ -2774,7 +2795,7 @@
               <w:noProof/>
             </w:rPr>
           </w:pPr>
-          <w:hyperlink w:anchor="_Toc237022798" w:history="1">
+          <w:hyperlink w:history="1" w:anchor="_Toc237022798">
             <w:r>
               <w:rPr>
                 <w:rStyle w:val="Hyperlink"/>
@@ -2843,7 +2864,7 @@
               <w:noProof/>
             </w:rPr>
           </w:pPr>
-          <w:hyperlink w:anchor="_Toc237022799" w:history="1">
+          <w:hyperlink w:history="1" w:anchor="_Toc237022799">
             <w:r>
               <w:rPr>
                 <w:rStyle w:val="Hyperlink"/>
@@ -2912,7 +2933,7 @@
               <w:noProof/>
             </w:rPr>
           </w:pPr>
-          <w:hyperlink w:anchor="_Toc237022800" w:history="1">
+          <w:hyperlink w:history="1" w:anchor="_Toc237022800">
             <w:r>
               <w:rPr>
                 <w:rStyle w:val="Hyperlink"/>
@@ -2981,7 +3002,7 @@
               <w:noProof/>
             </w:rPr>
           </w:pPr>
-          <w:hyperlink w:anchor="_Toc237022801" w:history="1">
+          <w:hyperlink w:history="1" w:anchor="_Toc237022801">
             <w:r>
               <w:rPr>
                 <w:rStyle w:val="Hyperlink"/>
@@ -3051,7 +3072,7 @@
               <w:noProof/>
             </w:rPr>
           </w:pPr>
-          <w:hyperlink w:anchor="_Toc237022802" w:history="1">
+          <w:hyperlink w:history="1" w:anchor="_Toc237022802">
             <w:r>
               <w:rPr>
                 <w:rStyle w:val="Hyperlink"/>
@@ -3134,7 +3155,7 @@
               <w:noProof/>
             </w:rPr>
           </w:pPr>
-          <w:hyperlink w:anchor="_Toc237022803" w:history="1">
+          <w:hyperlink w:history="1" w:anchor="_Toc237022803">
             <w:r>
               <w:rPr>
                 <w:rStyle w:val="Hyperlink"/>
@@ -3203,7 +3224,7 @@
               <w:noProof/>
             </w:rPr>
           </w:pPr>
-          <w:hyperlink w:anchor="_Toc237022804" w:history="1">
+          <w:hyperlink w:history="1" w:anchor="_Toc237022804">
             <w:r>
               <w:rPr>
                 <w:rStyle w:val="Hyperlink"/>
@@ -3272,7 +3293,7 @@
               <w:noProof/>
             </w:rPr>
           </w:pPr>
-          <w:hyperlink w:anchor="_Toc237022805" w:history="1">
+          <w:hyperlink w:history="1" w:anchor="_Toc237022805">
             <w:r>
               <w:rPr>
                 <w:rStyle w:val="Hyperlink"/>
@@ -3358,10 +3379,9 @@
         <w:pStyle w:val="Heading1"/>
         <w:spacing w:line="360" w:lineRule="auto"/>
       </w:pPr>
-      <w:bookmarkStart w:id="0" w:name="_Toc237021983"/>
-      <w:bookmarkStart w:id="1" w:name="_Toc237022774"/>
-      <w:r>
-        <w:lastRenderedPageBreak/>
+      <w:bookmarkStart w:name="_Toc237021983" w:id="0"/>
+      <w:bookmarkStart w:name="_Toc237022774" w:id="1"/>
+      <w:r>
         <w:t>Choose a target organisation</w:t>
       </w:r>
       <w:bookmarkEnd w:id="0"/>
@@ -3386,8 +3406,8 @@
         <w:pStyle w:val="Heading2"/>
         <w:spacing w:line="360" w:lineRule="auto"/>
       </w:pPr>
-      <w:bookmarkStart w:id="2" w:name="_Toc237021984"/>
-      <w:bookmarkStart w:id="3" w:name="_Toc237022775"/>
+      <w:bookmarkStart w:name="_Toc237021984" w:id="2"/>
+      <w:bookmarkStart w:name="_Toc237022775" w:id="3"/>
       <w:r>
         <w:rPr>
           <w:rStyle w:val="Heading2Char"/>
@@ -3415,7 +3435,7 @@
         <w:pStyle w:val="Heading3"/>
         <w:spacing w:line="360" w:lineRule="auto"/>
       </w:pPr>
-      <w:bookmarkStart w:id="4" w:name="_Toc237022776"/>
+      <w:bookmarkStart w:name="_Toc237022776" w:id="4"/>
       <w:r>
         <w:t>Type of Organisation: Small business</w:t>
       </w:r>
@@ -3441,8 +3461,8 @@
           <w:szCs w:val="22"/>
         </w:rPr>
       </w:pPr>
-      <w:bookmarkStart w:id="5" w:name="_Toc237021985"/>
-      <w:bookmarkStart w:id="6" w:name="_Toc237022777"/>
+      <w:bookmarkStart w:name="_Toc237021985" w:id="5"/>
+      <w:bookmarkStart w:name="_Toc237022777" w:id="6"/>
       <w:r>
         <w:rPr>
           <w:rStyle w:val="Heading3Char"/>
@@ -3482,8 +3502,8 @@
           <w:szCs w:val="22"/>
         </w:rPr>
       </w:pPr>
-      <w:bookmarkStart w:id="7" w:name="_Toc237021986"/>
-      <w:bookmarkStart w:id="8" w:name="_Toc237022778"/>
+      <w:bookmarkStart w:name="_Toc237021986" w:id="7"/>
+      <w:bookmarkStart w:name="_Toc237022778" w:id="8"/>
       <w:r>
         <w:rPr>
           <w:rStyle w:val="Heading3Char"/>
@@ -3653,8 +3673,8 @@
           <w:szCs w:val="22"/>
         </w:rPr>
       </w:pPr>
-      <w:bookmarkStart w:id="9" w:name="_Toc237021987"/>
-      <w:bookmarkStart w:id="10" w:name="_Toc237022779"/>
+      <w:bookmarkStart w:name="_Toc237021987" w:id="9"/>
+      <w:bookmarkStart w:name="_Toc237022779" w:id="10"/>
       <w:r>
         <w:rPr>
           <w:rStyle w:val="Heading3Char"/>
@@ -3715,7 +3735,7 @@
           <w:rStyle w:val="Heading1Char"/>
         </w:rPr>
       </w:pPr>
-      <w:bookmarkStart w:id="11" w:name="_Toc237022780"/>
+      <w:bookmarkStart w:name="_Toc237022780" w:id="11"/>
     </w:p>
     <w:p>
       <w:pPr>
@@ -3725,7 +3745,6 @@
         <w:rPr>
           <w:rStyle w:val="Heading1Char"/>
         </w:rPr>
-        <w:lastRenderedPageBreak/>
         <w:t>Question 2</w:t>
       </w:r>
       <w:bookmarkEnd w:id="11"/>
@@ -3761,8 +3780,8 @@
         <w:pStyle w:val="Heading2"/>
         <w:spacing w:line="360" w:lineRule="auto"/>
       </w:pPr>
-      <w:bookmarkStart w:id="12" w:name="_Toc237021988"/>
-      <w:bookmarkStart w:id="13" w:name="_Toc237022781"/>
+      <w:bookmarkStart w:name="_Toc237021988" w:id="12"/>
+      <w:bookmarkStart w:name="_Toc237022781" w:id="13"/>
       <w:r>
         <w:t>Website and Project Proposal -1</w:t>
       </w:r>
@@ -3835,8 +3854,8 @@
           <w:szCs w:val="22"/>
         </w:rPr>
       </w:pPr>
-      <w:bookmarkStart w:id="14" w:name="_Toc237021989"/>
-      <w:bookmarkStart w:id="15" w:name="_Toc237022782"/>
+      <w:bookmarkStart w:name="_Toc237021989" w:id="14"/>
+      <w:bookmarkStart w:name="_Toc237022782" w:id="15"/>
       <w:r>
         <w:rPr>
           <w:rStyle w:val="Heading3Char"/>
@@ -3977,8 +3996,8 @@
           <w:rStyle w:val="Heading3Char"/>
         </w:rPr>
       </w:pPr>
-      <w:bookmarkStart w:id="16" w:name="_Toc237021990"/>
-      <w:bookmarkStart w:id="17" w:name="_Toc237022783"/>
+      <w:bookmarkStart w:name="_Toc237021990" w:id="16"/>
+      <w:bookmarkStart w:name="_Toc237022783" w:id="17"/>
     </w:p>
     <w:p>
       <w:pPr>
@@ -4023,6 +4042,12 @@
           <w:szCs w:val="22"/>
         </w:rPr>
         <w:br/>
+      </w:r>
+      <w:r>
+        <w:rPr>
+          <w:sz w:val="22"/>
+          <w:szCs w:val="22"/>
+        </w:rPr>
         <w:t xml:space="preserve">Parents Looking for tutoring services </w:t>
       </w:r>
       <w:r>
@@ -4031,6 +4056,12 @@
           <w:szCs w:val="22"/>
         </w:rPr>
         <w:br/>
+      </w:r>
+      <w:r>
+        <w:rPr>
+          <w:sz w:val="22"/>
+          <w:szCs w:val="22"/>
+        </w:rPr>
         <w:t xml:space="preserve">Teachers recommending extra academic services </w:t>
       </w:r>
       <w:r>
@@ -4055,7 +4086,7 @@
           <w:rStyle w:val="Heading4Char"/>
         </w:rPr>
       </w:pPr>
-      <w:bookmarkStart w:id="18" w:name="_Toc237021991"/>
+      <w:bookmarkStart w:name="_Toc237021991" w:id="18"/>
     </w:p>
     <w:p>
       <w:pPr>
@@ -4214,8 +4245,8 @@
         </w:rPr>
         <w:t xml:space="preserve"> </w:t>
       </w:r>
-      <w:bookmarkStart w:id="19" w:name="_Toc237021992"/>
-      <w:bookmarkStart w:id="20" w:name="_Toc237022784"/>
+      <w:bookmarkStart w:name="_Toc237021992" w:id="19"/>
+      <w:bookmarkStart w:name="_Toc237022784" w:id="20"/>
       <w:r>
         <w:rPr>
           <w:rStyle w:val="Heading2Char"/>
@@ -4261,8 +4292,8 @@
           <w:szCs w:val="22"/>
         </w:rPr>
       </w:pPr>
-      <w:bookmarkStart w:id="21" w:name="_Toc237021993"/>
-      <w:bookmarkStart w:id="22" w:name="_Toc237022785"/>
+      <w:bookmarkStart w:name="_Toc237021993" w:id="21"/>
+      <w:bookmarkStart w:name="_Toc237022785" w:id="22"/>
       <w:r>
         <w:rPr>
           <w:rStyle w:val="Heading3Char"/>
@@ -4398,7 +4429,7 @@
           <w:rStyle w:val="Heading5Char"/>
         </w:rPr>
       </w:pPr>
-      <w:bookmarkStart w:id="23" w:name="_Toc237021994"/>
+      <w:bookmarkStart w:name="_Toc237021994" w:id="23"/>
       <w:r>
         <w:rPr>
           <w:rStyle w:val="Heading4Char"/>
@@ -4551,7 +4582,6 @@
         <w:rPr>
           <w:rStyle w:val="Heading5Char"/>
         </w:rPr>
-        <w:lastRenderedPageBreak/>
         <w:t xml:space="preserve">Functionality </w:t>
       </w:r>
       <w:r>
@@ -4655,8 +4685,8 @@
           <w:szCs w:val="22"/>
         </w:rPr>
       </w:pPr>
-      <w:bookmarkStart w:id="24" w:name="_Toc237021995"/>
-      <w:bookmarkStart w:id="25" w:name="_Toc237022786"/>
+      <w:bookmarkStart w:name="_Toc237021995" w:id="24"/>
+      <w:bookmarkStart w:name="_Toc237022786" w:id="25"/>
       <w:r>
         <w:rPr>
           <w:rStyle w:val="Heading2Char"/>
@@ -4754,8 +4784,8 @@
           <w:szCs w:val="22"/>
         </w:rPr>
       </w:pPr>
-      <w:bookmarkStart w:id="26" w:name="_Toc237021996"/>
-      <w:bookmarkStart w:id="27" w:name="_Toc237022787"/>
+      <w:bookmarkStart w:name="_Toc237021996" w:id="26"/>
+      <w:bookmarkStart w:name="_Toc237022787" w:id="27"/>
       <w:r>
         <w:rPr>
           <w:rStyle w:val="Heading3Char"/>
@@ -4824,7 +4854,7 @@
         <w:pStyle w:val="Heading4"/>
         <w:spacing w:line="360" w:lineRule="auto"/>
       </w:pPr>
-      <w:bookmarkStart w:id="28" w:name="_Toc237021997"/>
+      <w:bookmarkStart w:name="_Toc237021997" w:id="28"/>
       <w:r>
         <w:t>Layout and Design</w:t>
       </w:r>
@@ -4924,7 +4954,7 @@
           <w:rStyle w:val="Heading5Char"/>
         </w:rPr>
       </w:pPr>
-      <w:bookmarkStart w:id="29" w:name="_Toc237021998"/>
+      <w:bookmarkStart w:name="_Toc237021998" w:id="29"/>
       <w:r>
         <w:rPr>
           <w:rStyle w:val="Heading5Char"/>
@@ -5027,7 +5057,7 @@
         <w:spacing w:line="360" w:lineRule="auto"/>
         <w:rPr>
           <w:rStyle w:val="Heading1Char"/>
-          <w:rFonts w:asciiTheme="minorHAnsi" w:eastAsiaTheme="minorHAnsi" w:hAnsiTheme="minorHAnsi" w:cstheme="minorBidi"/>
+          <w:rFonts w:asciiTheme="minorHAnsi" w:hAnsiTheme="minorHAnsi" w:eastAsiaTheme="minorHAnsi" w:cstheme="minorBidi"/>
           <w:color w:val="auto"/>
           <w:sz w:val="22"/>
           <w:szCs w:val="22"/>
@@ -5054,14 +5084,13 @@
         </w:rPr>
         <w:br/>
       </w:r>
-      <w:bookmarkStart w:id="30" w:name="_Toc237021999"/>
+      <w:bookmarkStart w:name="_Toc237021999" w:id="30"/>
     </w:p>
     <w:p>
       <w:r>
         <w:rPr>
           <w:rStyle w:val="Heading1Char"/>
         </w:rPr>
-        <w:lastRenderedPageBreak/>
         <w:t>Low fidelity wireframe</w:t>
       </w:r>
       <w:bookmarkEnd w:id="30"/>
@@ -5072,29 +5101,26 @@
         <w:t xml:space="preserve"> </w:t>
       </w:r>
       <w:r>
-        <w:rPr>
-          <w:rStyle w:val="Heading1Char"/>
-        </w:rPr>
         <w:br/>
       </w:r>
       <w:r>
         <w:drawing>
-          <wp:inline distT="0" distB="0" distL="0" distR="0" wp14:anchorId="751C69C9" wp14:editId="7783E195">
+          <wp:inline wp14:editId="37A190F9" wp14:anchorId="751C69C9">
             <wp:extent cx="3873170" cy="2011680"/>
             <wp:effectExtent l="0" t="0" r="0" b="7620"/>
             <wp:docPr id="1723816520" name="Picture 1"/>
             <wp:cNvGraphicFramePr>
-              <a:graphicFrameLocks xmlns:a="http://schemas.openxmlformats.org/drawingml/2006/main" noChangeAspect="1"/>
+              <a:graphicFrameLocks noChangeAspect="1"/>
             </wp:cNvGraphicFramePr>
-            <a:graphic xmlns:a="http://schemas.openxmlformats.org/drawingml/2006/main">
-              <a:graphicData uri="http://schemas.openxmlformats.org/drawingml/2006/picture">
+            <a:graphic>
+              <a:graphicData xmlns:a="http://schemas.openxmlformats.org/drawingml/2006/main" uri="http://schemas.openxmlformats.org/drawingml/2006/picture">
                 <pic:pic xmlns:pic="http://schemas.openxmlformats.org/drawingml/2006/picture">
                   <pic:nvPicPr>
                     <pic:cNvPr id="1413498303" name=""/>
                     <pic:cNvPicPr/>
                   </pic:nvPicPr>
                   <pic:blipFill>
-                    <a:blip r:embed="rId9"/>
+                    <a:blip xmlns:r="http://schemas.openxmlformats.org/officeDocument/2006/relationships" r:embed="rId12"/>
                     <a:stretch>
                       <a:fillRect/>
                     </a:stretch>
@@ -5115,20 +5141,274 @@
         </w:drawing>
       </w:r>
       <w:r>
-        <w:rPr>
-          <w:rStyle w:val="Heading1Char"/>
-        </w:rPr>
         <w:br/>
       </w:r>
       <w:r>
-        <w:t xml:space="preserve">LOW FIDELITY wireframe Homepage </w:t>
-      </w:r>
-    </w:p>
-    <w:p>
+        <w:rPr/>
+        <w:t>LOW FIDELITY wireframe Homepage</w:t>
+      </w:r>
+      <w:r>
+        <w:rPr/>
+        <w:t>.</w:t>
+      </w:r>
+    </w:p>
+    <w:p/>
+    <w:p>
+      <w:pPr>
+        <w:pStyle w:val="Normal"/>
+      </w:pPr>
+      <w:r>
+        <w:drawing>
+          <wp:inline wp14:editId="2D10F8E6" wp14:anchorId="41257B51">
+            <wp:extent cx="3873170" cy="2011680"/>
+            <wp:effectExtent l="0" t="0" r="0" b="7620"/>
+            <wp:docPr id="2147205358" name="Picture 1"/>
+            <wp:cNvGraphicFramePr>
+              <a:graphicFrameLocks noChangeAspect="1"/>
+            </wp:cNvGraphicFramePr>
+            <a:graphic>
+              <a:graphicData xmlns:a="http://schemas.openxmlformats.org/drawingml/2006/main" uri="http://schemas.openxmlformats.org/drawingml/2006/picture">
+                <pic:pic xmlns:pic="http://schemas.openxmlformats.org/drawingml/2006/picture">
+                  <pic:nvPicPr>
+                    <pic:cNvPr id="1413498303" name=""/>
+                    <pic:cNvPicPr/>
+                  </pic:nvPicPr>
+                  <pic:blipFill>
+                    <a:blip xmlns:r="http://schemas.openxmlformats.org/officeDocument/2006/relationships" r:embed="rId12"/>
+                    <a:stretch>
+                      <a:fillRect/>
+                    </a:stretch>
+                  </pic:blipFill>
+                  <pic:spPr>
+                    <a:xfrm>
+                      <a:off x="0" y="0"/>
+                      <a:ext cx="3883483" cy="2017036"/>
+                    </a:xfrm>
+                    <a:prstGeom prst="rect">
+                      <a:avLst/>
+                    </a:prstGeom>
+                  </pic:spPr>
+                </pic:pic>
+              </a:graphicData>
+            </a:graphic>
+          </wp:inline>
+        </w:drawing>
+      </w:r>
       <w:r>
         <w:br/>
       </w:r>
       <w:r>
+        <w:rPr/>
+        <w:t xml:space="preserve">Low </w:t>
+      </w:r>
+      <w:r>
+        <w:rPr/>
+        <w:t>fedility</w:t>
+      </w:r>
+      <w:r>
+        <w:rPr/>
+        <w:t xml:space="preserve"> about us page </w:t>
+      </w:r>
+    </w:p>
+    <w:p>
+      <w:pPr>
+        <w:pStyle w:val="Normal"/>
+      </w:pPr>
+    </w:p>
+    <w:p>
+      <w:pPr>
+        <w:pStyle w:val="Normal"/>
+      </w:pPr>
+      <w:r>
+        <w:drawing>
+          <wp:inline wp14:editId="008AD2F5" wp14:anchorId="0941A02C">
+            <wp:extent cx="3873170" cy="2011680"/>
+            <wp:effectExtent l="0" t="0" r="0" b="7620"/>
+            <wp:docPr id="605724378" name="Picture 1"/>
+            <wp:cNvGraphicFramePr>
+              <a:graphicFrameLocks noChangeAspect="1"/>
+            </wp:cNvGraphicFramePr>
+            <a:graphic>
+              <a:graphicData xmlns:a="http://schemas.openxmlformats.org/drawingml/2006/main" uri="http://schemas.openxmlformats.org/drawingml/2006/picture">
+                <pic:pic xmlns:pic="http://schemas.openxmlformats.org/drawingml/2006/picture">
+                  <pic:nvPicPr>
+                    <pic:cNvPr id="1413498303" name=""/>
+                    <pic:cNvPicPr/>
+                  </pic:nvPicPr>
+                  <pic:blipFill>
+                    <a:blip xmlns:r="http://schemas.openxmlformats.org/officeDocument/2006/relationships" r:embed="rId12"/>
+                    <a:stretch>
+                      <a:fillRect/>
+                    </a:stretch>
+                  </pic:blipFill>
+                  <pic:spPr>
+                    <a:xfrm>
+                      <a:off x="0" y="0"/>
+                      <a:ext cx="3883483" cy="2017036"/>
+                    </a:xfrm>
+                    <a:prstGeom prst="rect">
+                      <a:avLst/>
+                    </a:prstGeom>
+                  </pic:spPr>
+                </pic:pic>
+              </a:graphicData>
+            </a:graphic>
+          </wp:inline>
+        </w:drawing>
+      </w:r>
+      <w:r>
+        <w:br/>
+      </w:r>
+      <w:r>
+        <w:rPr/>
+        <w:t xml:space="preserve">Low </w:t>
+      </w:r>
+      <w:r>
+        <w:rPr/>
+        <w:t>fedility</w:t>
+      </w:r>
+      <w:r>
+        <w:rPr/>
+        <w:t xml:space="preserve"> Contact us page</w:t>
+      </w:r>
+      <w:r>
+        <w:rPr/>
+        <w:t>.</w:t>
+      </w:r>
+    </w:p>
+    <w:p>
+      <w:pPr>
+        <w:pStyle w:val="Normal"/>
+      </w:pPr>
+    </w:p>
+    <w:p>
+      <w:pPr>
+        <w:pStyle w:val="Normal"/>
+      </w:pPr>
+      <w:r>
+        <w:drawing>
+          <wp:inline wp14:editId="306A666A" wp14:anchorId="7AE47C4F">
+            <wp:extent cx="3873170" cy="2011680"/>
+            <wp:effectExtent l="0" t="0" r="0" b="7620"/>
+            <wp:docPr id="1935739863" name="Picture 1"/>
+            <wp:cNvGraphicFramePr>
+              <a:graphicFrameLocks noChangeAspect="1"/>
+            </wp:cNvGraphicFramePr>
+            <a:graphic>
+              <a:graphicData xmlns:a="http://schemas.openxmlformats.org/drawingml/2006/main" uri="http://schemas.openxmlformats.org/drawingml/2006/picture">
+                <pic:pic xmlns:pic="http://schemas.openxmlformats.org/drawingml/2006/picture">
+                  <pic:nvPicPr>
+                    <pic:cNvPr id="1413498303" name=""/>
+                    <pic:cNvPicPr/>
+                  </pic:nvPicPr>
+                  <pic:blipFill>
+                    <a:blip xmlns:r="http://schemas.openxmlformats.org/officeDocument/2006/relationships" r:embed="rId12"/>
+                    <a:stretch>
+                      <a:fillRect/>
+                    </a:stretch>
+                  </pic:blipFill>
+                  <pic:spPr>
+                    <a:xfrm>
+                      <a:off x="0" y="0"/>
+                      <a:ext cx="3883483" cy="2017036"/>
+                    </a:xfrm>
+                    <a:prstGeom prst="rect">
+                      <a:avLst/>
+                    </a:prstGeom>
+                  </pic:spPr>
+                </pic:pic>
+              </a:graphicData>
+            </a:graphic>
+          </wp:inline>
+        </w:drawing>
+      </w:r>
+      <w:r>
+        <w:br/>
+      </w:r>
+      <w:r>
+        <w:rPr/>
+        <w:t xml:space="preserve">Low </w:t>
+      </w:r>
+      <w:r>
+        <w:rPr/>
+        <w:t>fedility</w:t>
+      </w:r>
+      <w:r>
+        <w:rPr/>
+        <w:t xml:space="preserve"> Textbook page</w:t>
+      </w:r>
+      <w:r>
+        <w:rPr/>
+        <w:t>.</w:t>
+      </w:r>
+    </w:p>
+    <w:p>
+      <w:pPr>
+        <w:pStyle w:val="Normal"/>
+      </w:pPr>
+    </w:p>
+    <w:p>
+      <w:pPr>
+        <w:pStyle w:val="Normal"/>
+      </w:pPr>
+      <w:r>
+        <w:drawing>
+          <wp:inline wp14:editId="533E82DA" wp14:anchorId="306AAE03">
+            <wp:extent cx="3873170" cy="2011680"/>
+            <wp:effectExtent l="0" t="0" r="0" b="7620"/>
+            <wp:docPr id="1977535412" name="Picture 1"/>
+            <wp:cNvGraphicFramePr>
+              <a:graphicFrameLocks noChangeAspect="1"/>
+            </wp:cNvGraphicFramePr>
+            <a:graphic>
+              <a:graphicData xmlns:a="http://schemas.openxmlformats.org/drawingml/2006/main" uri="http://schemas.openxmlformats.org/drawingml/2006/picture">
+                <pic:pic xmlns:pic="http://schemas.openxmlformats.org/drawingml/2006/picture">
+                  <pic:nvPicPr>
+                    <pic:cNvPr id="1413498303" name=""/>
+                    <pic:cNvPicPr/>
+                  </pic:nvPicPr>
+                  <pic:blipFill>
+                    <a:blip xmlns:r="http://schemas.openxmlformats.org/officeDocument/2006/relationships" r:embed="rId12"/>
+                    <a:stretch>
+                      <a:fillRect/>
+                    </a:stretch>
+                  </pic:blipFill>
+                  <pic:spPr>
+                    <a:xfrm>
+                      <a:off x="0" y="0"/>
+                      <a:ext cx="3883483" cy="2017036"/>
+                    </a:xfrm>
+                    <a:prstGeom prst="rect">
+                      <a:avLst/>
+                    </a:prstGeom>
+                  </pic:spPr>
+                </pic:pic>
+              </a:graphicData>
+            </a:graphic>
+          </wp:inline>
+        </w:drawing>
+      </w:r>
+      <w:r>
+        <w:br/>
+      </w:r>
+      <w:r>
+        <w:rPr/>
+        <w:t xml:space="preserve">Low </w:t>
+      </w:r>
+      <w:r>
+        <w:rPr/>
+        <w:t>fedility</w:t>
+      </w:r>
+      <w:r>
+        <w:rPr/>
+        <w:t xml:space="preserve"> Services offered page.</w:t>
+      </w:r>
+    </w:p>
+    <w:p>
+      <w:r>
+        <w:br/>
+      </w:r>
+      <w:r>
         <w:rPr>
           <w:rStyle w:val="Heading2Char"/>
         </w:rPr>
@@ -5146,7 +5426,7 @@
       <w:r>
         <w:br/>
       </w:r>
-      <w:hyperlink r:id="rId10" w:history="1">
+      <w:hyperlink w:history="1" r:id="rId13">
         <w:r>
           <w:rPr>
             <w:rStyle w:val="Hyperlink"/>
@@ -5267,8 +5547,8 @@
         <w:pStyle w:val="Heading1"/>
         <w:spacing w:line="360" w:lineRule="auto"/>
       </w:pPr>
-      <w:bookmarkStart w:id="31" w:name="_Toc237022000"/>
-      <w:bookmarkStart w:id="32" w:name="_Toc237022788"/>
+      <w:bookmarkStart w:name="_Toc237022000" w:id="31"/>
+      <w:bookmarkStart w:name="_Toc237022788" w:id="32"/>
       <w:r>
         <w:t>7. Timeline and Milestones</w:t>
       </w:r>
@@ -5437,7 +5717,6 @@
                 <w:sz w:val="22"/>
                 <w:szCs w:val="22"/>
               </w:rPr>
-              <w:lastRenderedPageBreak/>
               <w:t>Week-3</w:t>
             </w:r>
           </w:p>
@@ -5704,14 +5983,14 @@
         <w:pStyle w:val="Heading1"/>
         <w:spacing w:line="360" w:lineRule="auto"/>
       </w:pPr>
-      <w:bookmarkStart w:id="33" w:name="_Toc237022001"/>
+      <w:bookmarkStart w:name="_Toc237022001" w:id="33"/>
     </w:p>
     <w:p>
       <w:pPr>
         <w:pStyle w:val="Heading1"/>
         <w:spacing w:line="360" w:lineRule="auto"/>
       </w:pPr>
-      <w:bookmarkStart w:id="34" w:name="_Toc237022789"/>
+      <w:bookmarkStart w:name="_Toc237022789" w:id="34"/>
       <w:r>
         <w:t>8. Budget</w:t>
       </w:r>
@@ -6068,8 +6347,8 @@
         <w:pStyle w:val="Heading1"/>
         <w:spacing w:line="360" w:lineRule="auto"/>
       </w:pPr>
-      <w:bookmarkStart w:id="35" w:name="_Toc237022002"/>
-      <w:bookmarkStart w:id="36" w:name="_Toc237022790"/>
+      <w:bookmarkStart w:name="_Toc237022002" w:id="35"/>
+      <w:bookmarkStart w:name="_Toc237022790" w:id="36"/>
       <w:r>
         <w:t>Proposal 2</w:t>
       </w:r>
@@ -6084,7 +6363,7 @@
         <w:pStyle w:val="Heading2"/>
         <w:spacing w:line="360" w:lineRule="auto"/>
       </w:pPr>
-      <w:bookmarkStart w:id="37" w:name="_Toc237022791"/>
+      <w:bookmarkStart w:name="_Toc237022791" w:id="37"/>
       <w:r>
         <w:t>Organisation name:</w:t>
       </w:r>
@@ -6118,9 +6397,8 @@
           <w:szCs w:val="22"/>
         </w:rPr>
       </w:pPr>
-      <w:bookmarkStart w:id="38" w:name="_Toc237022003"/>
-      <w:r>
-        <w:lastRenderedPageBreak/>
+      <w:bookmarkStart w:name="_Toc237022003" w:id="38"/>
+      <w:r>
         <w:t>Project overview:</w:t>
       </w:r>
       <w:bookmarkEnd w:id="38"/>
@@ -6166,8 +6444,8 @@
           <w:szCs w:val="22"/>
         </w:rPr>
       </w:pPr>
-      <w:bookmarkStart w:id="39" w:name="_Toc237022004"/>
-      <w:bookmarkStart w:id="40" w:name="_Toc237022792"/>
+      <w:bookmarkStart w:name="_Toc237022004" w:id="39"/>
+      <w:bookmarkStart w:name="_Toc237022792" w:id="40"/>
       <w:r>
         <w:rPr>
           <w:rStyle w:val="Heading3Char"/>
@@ -6195,6 +6473,12 @@
           <w:szCs w:val="22"/>
         </w:rPr>
         <w:br/>
+      </w:r>
+      <w:r>
+        <w:rPr>
+          <w:sz w:val="22"/>
+          <w:szCs w:val="22"/>
+        </w:rPr>
         <w:t xml:space="preserve">Promote the grocery store and its products </w:t>
       </w:r>
       <w:r>
@@ -6203,6 +6487,12 @@
           <w:szCs w:val="22"/>
         </w:rPr>
         <w:br/>
+      </w:r>
+      <w:r>
+        <w:rPr>
+          <w:sz w:val="22"/>
+          <w:szCs w:val="22"/>
+        </w:rPr>
         <w:t xml:space="preserve">Display weekly specials and promotions </w:t>
       </w:r>
       <w:r>
@@ -6211,6 +6501,12 @@
           <w:szCs w:val="22"/>
         </w:rPr>
         <w:br/>
+      </w:r>
+      <w:r>
+        <w:rPr>
+          <w:sz w:val="22"/>
+          <w:szCs w:val="22"/>
+        </w:rPr>
         <w:t xml:space="preserve">Provide store information and operating hours </w:t>
       </w:r>
       <w:r>
@@ -6219,6 +6515,12 @@
           <w:szCs w:val="22"/>
         </w:rPr>
         <w:br/>
+      </w:r>
+      <w:r>
+        <w:rPr>
+          <w:sz w:val="22"/>
+          <w:szCs w:val="22"/>
+        </w:rPr>
         <w:t xml:space="preserve">allow customers to browse products by category </w:t>
       </w:r>
       <w:r>
@@ -6227,6 +6529,12 @@
           <w:szCs w:val="22"/>
         </w:rPr>
         <w:br/>
+      </w:r>
+      <w:r>
+        <w:rPr>
+          <w:sz w:val="22"/>
+          <w:szCs w:val="22"/>
+        </w:rPr>
         <w:t xml:space="preserve">increase customer engagement and attract new shoppers </w:t>
       </w:r>
     </w:p>
@@ -6252,8 +6560,8 @@
           <w:szCs w:val="22"/>
         </w:rPr>
       </w:pPr>
-      <w:bookmarkStart w:id="41" w:name="_Toc237022005"/>
-      <w:bookmarkStart w:id="42" w:name="_Toc237022793"/>
+      <w:bookmarkStart w:name="_Toc237022005" w:id="41"/>
+      <w:bookmarkStart w:name="_Toc237022793" w:id="42"/>
       <w:r>
         <w:rPr>
           <w:rStyle w:val="Heading3Char"/>
@@ -6383,7 +6691,7 @@
           <w:szCs w:val="22"/>
         </w:rPr>
       </w:pPr>
-      <w:bookmarkStart w:id="43" w:name="_Toc237022794"/>
+      <w:bookmarkStart w:name="_Toc237022794" w:id="43"/>
       <w:r>
         <w:rPr>
           <w:rStyle w:val="Heading3Char"/>
@@ -6541,7 +6849,7 @@
           <w:szCs w:val="22"/>
         </w:rPr>
       </w:pPr>
-      <w:bookmarkStart w:id="44" w:name="_Toc237022006"/>
+      <w:bookmarkStart w:name="_Toc237022006" w:id="44"/>
       <w:r>
         <w:rPr>
           <w:rStyle w:val="Heading4Char"/>
@@ -6567,7 +6875,6 @@
           <w:sz w:val="22"/>
           <w:szCs w:val="22"/>
         </w:rPr>
-        <w:lastRenderedPageBreak/>
         <w:t>effectivity and provide shoppers with quick access to product information before visiting the store. It will also strengthen the business professional image and improve customer satisfaction</w:t>
       </w:r>
     </w:p>
@@ -6588,7 +6895,7 @@
           <w:szCs w:val="22"/>
         </w:rPr>
       </w:pPr>
-      <w:bookmarkStart w:id="45" w:name="_Toc237022007"/>
+      <w:bookmarkStart w:name="_Toc237022007" w:id="45"/>
       <w:r>
         <w:rPr>
           <w:rStyle w:val="Heading4Char"/>
@@ -6629,14 +6936,14 @@
         <w:spacing w:line="360" w:lineRule="auto"/>
         <w:rPr>
           <w:rStyle w:val="Heading2Char"/>
-          <w:rFonts w:asciiTheme="minorHAnsi" w:eastAsiaTheme="minorHAnsi" w:hAnsiTheme="minorHAnsi" w:cstheme="minorBidi"/>
+          <w:rFonts w:asciiTheme="minorHAnsi" w:hAnsiTheme="minorHAnsi" w:eastAsiaTheme="minorHAnsi" w:cstheme="minorBidi"/>
           <w:color w:val="auto"/>
           <w:sz w:val="22"/>
           <w:szCs w:val="22"/>
         </w:rPr>
       </w:pPr>
-      <w:bookmarkStart w:id="46" w:name="_Toc237022008"/>
-      <w:bookmarkStart w:id="47" w:name="_Toc237022795"/>
+      <w:bookmarkStart w:name="_Toc237022008" w:id="46"/>
+      <w:bookmarkStart w:name="_Toc237022795" w:id="47"/>
       <w:r>
         <w:rPr>
           <w:rStyle w:val="Heading2Char"/>
@@ -6771,14 +7078,14 @@
         <w:spacing w:line="360" w:lineRule="auto"/>
         <w:rPr>
           <w:rStyle w:val="Heading2Char"/>
-          <w:rFonts w:asciiTheme="minorHAnsi" w:eastAsiaTheme="minorHAnsi" w:hAnsiTheme="minorHAnsi" w:cstheme="minorBidi"/>
+          <w:rFonts w:asciiTheme="minorHAnsi" w:hAnsiTheme="minorHAnsi" w:eastAsiaTheme="minorHAnsi" w:cstheme="minorBidi"/>
           <w:color w:val="auto"/>
           <w:sz w:val="22"/>
           <w:szCs w:val="22"/>
         </w:rPr>
       </w:pPr>
-      <w:bookmarkStart w:id="48" w:name="_Toc237022009"/>
-      <w:bookmarkStart w:id="49" w:name="_Toc237022796"/>
+      <w:bookmarkStart w:name="_Toc237022009" w:id="48"/>
+      <w:bookmarkStart w:name="_Toc237022796" w:id="49"/>
       <w:r>
         <w:rPr>
           <w:rStyle w:val="Heading2Char"/>
@@ -7012,7 +7319,7 @@
           <w:szCs w:val="22"/>
         </w:rPr>
       </w:pPr>
-      <w:bookmarkStart w:id="50" w:name="_Toc237022010"/>
+      <w:bookmarkStart w:name="_Toc237022010" w:id="50"/>
       <w:r>
         <w:rPr>
           <w:b/>
@@ -7089,7 +7396,6 @@
           <w:sz w:val="22"/>
           <w:szCs w:val="22"/>
         </w:rPr>
-        <w:lastRenderedPageBreak/>
         <w:t xml:space="preserve">Weekly promotions </w:t>
       </w:r>
     </w:p>
@@ -7172,14 +7478,14 @@
         <w:spacing w:line="360" w:lineRule="auto"/>
         <w:rPr>
           <w:rStyle w:val="Heading1Char"/>
-          <w:rFonts w:asciiTheme="minorHAnsi" w:eastAsiaTheme="minorHAnsi" w:hAnsiTheme="minorHAnsi" w:cstheme="minorBidi"/>
+          <w:rFonts w:asciiTheme="minorHAnsi" w:hAnsiTheme="minorHAnsi" w:eastAsiaTheme="minorHAnsi" w:cstheme="minorBidi"/>
           <w:color w:val="auto"/>
           <w:sz w:val="22"/>
           <w:szCs w:val="22"/>
         </w:rPr>
       </w:pPr>
-      <w:bookmarkStart w:id="51" w:name="_Toc237022011"/>
-      <w:bookmarkStart w:id="52" w:name="_Toc237022797"/>
+      <w:bookmarkStart w:name="_Toc237022011" w:id="51"/>
+      <w:bookmarkStart w:name="_Toc237022797" w:id="52"/>
       <w:r>
         <w:rPr>
           <w:rStyle w:val="Heading1Char"/>
@@ -7297,8 +7603,8 @@
           <w:szCs w:val="22"/>
         </w:rPr>
       </w:pPr>
-      <w:bookmarkStart w:id="53" w:name="_Toc237022012"/>
-      <w:bookmarkStart w:id="54" w:name="_Toc237022798"/>
+      <w:bookmarkStart w:name="_Toc237022012" w:id="53"/>
+      <w:bookmarkStart w:name="_Toc237022798" w:id="54"/>
       <w:r>
         <w:rPr>
           <w:rStyle w:val="Heading2Char"/>
@@ -7343,34 +7649,54 @@
           <w:sz w:val="22"/>
           <w:szCs w:val="22"/>
         </w:rPr>
-        <w:t xml:space="preserve">Body text : </w:t>
-      </w:r>
-      <w:r>
-        <w:rPr>
-          <w:sz w:val="22"/>
-          <w:szCs w:val="22"/>
-        </w:rPr>
-        <w:t xml:space="preserve">Aptos </w:t>
-      </w:r>
-    </w:p>
-    <w:p>
-      <w:pPr>
-        <w:spacing w:line="360" w:lineRule="auto"/>
+        <w:t xml:space="preserve">Body </w:t>
+      </w:r>
+      <w:proofErr w:type="gramStart"/>
+      <w:r>
         <w:rPr>
           <w:b/>
           <w:bCs/>
           <w:sz w:val="22"/>
           <w:szCs w:val="22"/>
         </w:rPr>
-      </w:pPr>
-      <w:bookmarkStart w:id="55" w:name="_Toc237022013"/>
+        <w:t>text :</w:t>
+      </w:r>
+      <w:proofErr w:type="gramEnd"/>
+      <w:r>
+        <w:rPr>
+          <w:b/>
+          <w:bCs/>
+          <w:sz w:val="22"/>
+          <w:szCs w:val="22"/>
+        </w:rPr>
+        <w:t xml:space="preserve"> </w:t>
+      </w:r>
+      <w:r>
+        <w:rPr>
+          <w:sz w:val="22"/>
+          <w:szCs w:val="22"/>
+        </w:rPr>
+        <w:t xml:space="preserve">Aptos </w:t>
+      </w:r>
+    </w:p>
+    <w:p>
+      <w:pPr>
+        <w:spacing w:line="360" w:lineRule="auto"/>
+        <w:rPr>
+          <w:b/>
+          <w:bCs/>
+          <w:sz w:val="22"/>
+          <w:szCs w:val="22"/>
+        </w:rPr>
+      </w:pPr>
+      <w:bookmarkStart w:name="_Toc237022013" w:id="55"/>
     </w:p>
     <w:p>
       <w:pPr>
         <w:pStyle w:val="Heading3"/>
         <w:spacing w:line="360" w:lineRule="auto"/>
       </w:pPr>
-      <w:bookmarkStart w:id="56" w:name="_Toc237022799"/>
+      <w:bookmarkStart w:name="_Toc237022799" w:id="56"/>
       <w:r>
         <w:t>Layout and design</w:t>
       </w:r>
@@ -7493,8 +7819,8 @@
           <w:szCs w:val="22"/>
         </w:rPr>
       </w:pPr>
-      <w:bookmarkStart w:id="57" w:name="_Toc237022014"/>
-      <w:bookmarkStart w:id="58" w:name="_Toc237022800"/>
+      <w:bookmarkStart w:name="_Toc237022014" w:id="57"/>
+      <w:bookmarkStart w:name="_Toc237022800" w:id="58"/>
       <w:r>
         <w:rPr>
           <w:rStyle w:val="Heading3Char"/>
@@ -7674,8 +8000,8 @@
         <w:pStyle w:val="Heading1"/>
         <w:spacing w:line="360" w:lineRule="auto"/>
       </w:pPr>
-      <w:bookmarkStart w:id="59" w:name="_Toc237022015"/>
-      <w:bookmarkStart w:id="60" w:name="_Toc237022801"/>
+      <w:bookmarkStart w:name="_Toc237022015" w:id="59"/>
+      <w:bookmarkStart w:name="_Toc237022801" w:id="60"/>
       <w:r>
         <w:t>Low-Fidelity wireframe</w:t>
       </w:r>
@@ -7692,6 +8018,9 @@
     </w:p>
     <w:p>
       <w:r>
+        <w:rPr>
+          <w:noProof/>
+        </w:rPr>
         <w:drawing>
           <wp:inline distT="0" distB="0" distL="0" distR="0" wp14:anchorId="377E9059" wp14:editId="1B35BF70">
             <wp:extent cx="4601785" cy="2390114"/>
@@ -7708,7 +8037,7 @@
                     <pic:cNvPicPr/>
                   </pic:nvPicPr>
                   <pic:blipFill>
-                    <a:blip r:embed="rId9"/>
+                    <a:blip r:embed="rId12"/>
                     <a:stretch>
                       <a:fillRect/>
                     </a:stretch>
@@ -7753,8 +8082,8 @@
           <w:szCs w:val="22"/>
         </w:rPr>
       </w:pPr>
-      <w:bookmarkStart w:id="61" w:name="_Toc237022016"/>
-      <w:bookmarkStart w:id="62" w:name="_Toc237022802"/>
+      <w:bookmarkStart w:name="_Toc237022016" w:id="61"/>
+      <w:bookmarkStart w:name="_Toc237022802" w:id="62"/>
       <w:r>
         <w:rPr>
           <w:rStyle w:val="Heading1Char"/>
@@ -7787,7 +8116,7 @@
         </w:rPr>
         <w:br/>
       </w:r>
-      <w:hyperlink r:id="rId11" w:history="1">
+      <w:hyperlink w:history="1" r:id="rId14">
         <w:r>
           <w:rPr>
             <w:rStyle w:val="Hyperlink"/>
@@ -7808,7 +8137,7 @@
           <w:szCs w:val="22"/>
         </w:rPr>
       </w:pPr>
-      <w:bookmarkStart w:id="63" w:name="_Toc237022017"/>
+      <w:bookmarkStart w:name="_Toc237022017" w:id="63"/>
       <w:r>
         <w:t>Hosting:</w:t>
       </w:r>
@@ -7911,7 +8240,6 @@
         <w:br/>
       </w:r>
       <w:r>
-        <w:lastRenderedPageBreak/>
         <w:t>Browser compatibility:</w:t>
       </w:r>
       <w:r>
@@ -7943,7 +8271,7 @@
           <w:szCs w:val="22"/>
         </w:rPr>
       </w:pPr>
-      <w:bookmarkStart w:id="64" w:name="_Toc237022018"/>
+      <w:bookmarkStart w:name="_Toc237022018" w:id="64"/>
       <w:r>
         <w:t>Responsive Design:</w:t>
       </w:r>
@@ -7967,8 +8295,8 @@
         <w:pStyle w:val="Heading1"/>
         <w:spacing w:line="360" w:lineRule="auto"/>
       </w:pPr>
-      <w:bookmarkStart w:id="65" w:name="_Toc237022019"/>
-      <w:bookmarkStart w:id="66" w:name="_Toc237022803"/>
+      <w:bookmarkStart w:name="_Toc237022019" w:id="65"/>
+      <w:bookmarkStart w:name="_Toc237022803" w:id="66"/>
       <w:r>
         <w:t>Timeline and Milestones</w:t>
       </w:r>
@@ -8391,7 +8719,7 @@
         </w:rPr>
         <w:br/>
       </w:r>
-      <w:bookmarkStart w:id="67" w:name="_Toc237022020"/>
+      <w:bookmarkStart w:name="_Toc237022020" w:id="67"/>
     </w:p>
     <w:p>
       <w:pPr>
@@ -8403,7 +8731,7 @@
           <w:szCs w:val="22"/>
         </w:rPr>
       </w:pPr>
-      <w:bookmarkStart w:id="68" w:name="_Toc237022804"/>
+      <w:bookmarkStart w:name="_Toc237022804" w:id="68"/>
       <w:r>
         <w:t>Budget</w:t>
       </w:r>
@@ -8810,13 +9138,12 @@
           <w:szCs w:val="22"/>
         </w:rPr>
       </w:pPr>
-      <w:bookmarkStart w:id="69" w:name="_Toc237022021"/>
-      <w:bookmarkStart w:id="70" w:name="_Toc237022805"/>
+      <w:bookmarkStart w:name="_Toc237022021" w:id="69"/>
+      <w:bookmarkStart w:name="_Toc237022805" w:id="70"/>
       <w:r>
         <w:rPr>
           <w:rStyle w:val="Heading1Char"/>
         </w:rPr>
-        <w:lastRenderedPageBreak/>
         <w:t>Reference list</w:t>
       </w:r>
       <w:bookmarkEnd w:id="69"/>
@@ -8856,9 +9183,25 @@
           <w:sz w:val="22"/>
           <w:szCs w:val="22"/>
         </w:rPr>
-        <w:t xml:space="preserve">. 2025. We hosting services. </w:t>
-      </w:r>
-      <w:hyperlink r:id="rId12" w:history="1">
+        <w:t xml:space="preserve">. 2025. We </w:t>
+      </w:r>
+      <w:proofErr w:type="gramStart"/>
+      <w:r>
+        <w:rPr>
+          <w:sz w:val="22"/>
+          <w:szCs w:val="22"/>
+        </w:rPr>
+        <w:t>hosting</w:t>
+      </w:r>
+      <w:proofErr w:type="gramEnd"/>
+      <w:r>
+        <w:rPr>
+          <w:sz w:val="22"/>
+          <w:szCs w:val="22"/>
+        </w:rPr>
+        <w:t xml:space="preserve"> services. </w:t>
+      </w:r>
+      <w:hyperlink w:history="1" r:id="rId15">
         <w:r>
           <w:rPr>
             <w:rStyle w:val="Hyperlink"/>
@@ -8884,7 +9227,7 @@
         </w:rPr>
         <w:t xml:space="preserve">Google Domains. 2025. Domain registration. </w:t>
       </w:r>
-      <w:hyperlink r:id="rId13" w:history="1">
+      <w:hyperlink w:history="1" r:id="rId16">
         <w:r>
           <w:rPr>
             <w:rStyle w:val="Hyperlink"/>
@@ -8910,7 +9253,7 @@
         </w:rPr>
         <w:t xml:space="preserve">MDN Web Docs.2025. Learn web development. </w:t>
       </w:r>
-      <w:hyperlink r:id="rId14" w:history="1">
+      <w:hyperlink w:history="1" r:id="rId17">
         <w:r>
           <w:rPr>
             <w:rStyle w:val="Hyperlink"/>
@@ -8999,7 +9342,7 @@
       </w:pPr>
     </w:p>
     <w:sectPr>
-      <w:pgSz w:w="11906" w:h="16838"/>
+      <w:pgSz w:w="11906" w:h="16838" w:orient="portrait"/>
       <w:pgMar w:top="1440" w:right="1440" w:bottom="1440" w:left="1440" w:header="708" w:footer="708" w:gutter="0"/>
       <w:pgNumType w:start="0"/>
       <w:cols w:space="708"/>
@@ -9115,7 +9458,7 @@
         <w:ind w:left="720" w:hanging="360"/>
       </w:pPr>
       <w:rPr>
-        <w:rFonts w:ascii="Symbol" w:hAnsi="Symbol" w:hint="default"/>
+        <w:rFonts w:hint="default" w:ascii="Symbol" w:hAnsi="Symbol"/>
       </w:rPr>
     </w:lvl>
     <w:lvl w:ilvl="1" w:tplc="1C090003" w:tentative="1">
@@ -9127,7 +9470,7 @@
         <w:ind w:left="1440" w:hanging="360"/>
       </w:pPr>
       <w:rPr>
-        <w:rFonts w:ascii="Courier New" w:hAnsi="Courier New" w:cs="Courier New" w:hint="default"/>
+        <w:rFonts w:hint="default" w:ascii="Courier New" w:hAnsi="Courier New" w:cs="Courier New"/>
       </w:rPr>
     </w:lvl>
     <w:lvl w:ilvl="2" w:tplc="1C090005" w:tentative="1">
@@ -9139,7 +9482,7 @@
         <w:ind w:left="2160" w:hanging="360"/>
       </w:pPr>
       <w:rPr>
-        <w:rFonts w:ascii="Wingdings" w:hAnsi="Wingdings" w:hint="default"/>
+        <w:rFonts w:hint="default" w:ascii="Wingdings" w:hAnsi="Wingdings"/>
       </w:rPr>
     </w:lvl>
     <w:lvl w:ilvl="3" w:tplc="1C090001" w:tentative="1">
@@ -9151,7 +9494,7 @@
         <w:ind w:left="2880" w:hanging="360"/>
       </w:pPr>
       <w:rPr>
-        <w:rFonts w:ascii="Symbol" w:hAnsi="Symbol" w:hint="default"/>
+        <w:rFonts w:hint="default" w:ascii="Symbol" w:hAnsi="Symbol"/>
       </w:rPr>
     </w:lvl>
     <w:lvl w:ilvl="4" w:tplc="1C090003" w:tentative="1">
@@ -9163,7 +9506,7 @@
         <w:ind w:left="3600" w:hanging="360"/>
       </w:pPr>
       <w:rPr>
-        <w:rFonts w:ascii="Courier New" w:hAnsi="Courier New" w:cs="Courier New" w:hint="default"/>
+        <w:rFonts w:hint="default" w:ascii="Courier New" w:hAnsi="Courier New" w:cs="Courier New"/>
       </w:rPr>
     </w:lvl>
     <w:lvl w:ilvl="5" w:tplc="1C090005" w:tentative="1">
@@ -9175,7 +9518,7 @@
         <w:ind w:left="4320" w:hanging="360"/>
       </w:pPr>
       <w:rPr>
-        <w:rFonts w:ascii="Wingdings" w:hAnsi="Wingdings" w:hint="default"/>
+        <w:rFonts w:hint="default" w:ascii="Wingdings" w:hAnsi="Wingdings"/>
       </w:rPr>
     </w:lvl>
     <w:lvl w:ilvl="6" w:tplc="1C090001" w:tentative="1">
@@ -9187,7 +9530,7 @@
         <w:ind w:left="5040" w:hanging="360"/>
       </w:pPr>
       <w:rPr>
-        <w:rFonts w:ascii="Symbol" w:hAnsi="Symbol" w:hint="default"/>
+        <w:rFonts w:hint="default" w:ascii="Symbol" w:hAnsi="Symbol"/>
       </w:rPr>
     </w:lvl>
     <w:lvl w:ilvl="7" w:tplc="1C090003" w:tentative="1">
@@ -9199,7 +9542,7 @@
         <w:ind w:left="5760" w:hanging="360"/>
       </w:pPr>
       <w:rPr>
-        <w:rFonts w:ascii="Courier New" w:hAnsi="Courier New" w:cs="Courier New" w:hint="default"/>
+        <w:rFonts w:hint="default" w:ascii="Courier New" w:hAnsi="Courier New" w:cs="Courier New"/>
       </w:rPr>
     </w:lvl>
     <w:lvl w:ilvl="8" w:tplc="1C090005" w:tentative="1">
@@ -9211,7 +9554,7 @@
         <w:ind w:left="6480" w:hanging="360"/>
       </w:pPr>
       <w:rPr>
-        <w:rFonts w:ascii="Wingdings" w:hAnsi="Wingdings" w:hint="default"/>
+        <w:rFonts w:hint="default" w:ascii="Wingdings" w:hAnsi="Wingdings"/>
       </w:rPr>
     </w:lvl>
   </w:abstractNum>
@@ -9228,7 +9571,7 @@
         <w:ind w:left="1440" w:hanging="360"/>
       </w:pPr>
       <w:rPr>
-        <w:rFonts w:ascii="Symbol" w:hAnsi="Symbol" w:hint="default"/>
+        <w:rFonts w:hint="default" w:ascii="Symbol" w:hAnsi="Symbol"/>
       </w:rPr>
     </w:lvl>
     <w:lvl w:ilvl="1" w:tplc="1C090003" w:tentative="1">
@@ -9240,7 +9583,7 @@
         <w:ind w:left="2160" w:hanging="360"/>
       </w:pPr>
       <w:rPr>
-        <w:rFonts w:ascii="Courier New" w:hAnsi="Courier New" w:cs="Courier New" w:hint="default"/>
+        <w:rFonts w:hint="default" w:ascii="Courier New" w:hAnsi="Courier New" w:cs="Courier New"/>
       </w:rPr>
     </w:lvl>
     <w:lvl w:ilvl="2" w:tplc="1C090005" w:tentative="1">
@@ -9252,7 +9595,7 @@
         <w:ind w:left="2880" w:hanging="360"/>
       </w:pPr>
       <w:rPr>
-        <w:rFonts w:ascii="Wingdings" w:hAnsi="Wingdings" w:hint="default"/>
+        <w:rFonts w:hint="default" w:ascii="Wingdings" w:hAnsi="Wingdings"/>
       </w:rPr>
     </w:lvl>
     <w:lvl w:ilvl="3" w:tplc="1C090001" w:tentative="1">
@@ -9264,7 +9607,7 @@
         <w:ind w:left="3600" w:hanging="360"/>
       </w:pPr>
       <w:rPr>
-        <w:rFonts w:ascii="Symbol" w:hAnsi="Symbol" w:hint="default"/>
+        <w:rFonts w:hint="default" w:ascii="Symbol" w:hAnsi="Symbol"/>
       </w:rPr>
     </w:lvl>
     <w:lvl w:ilvl="4" w:tplc="1C090003" w:tentative="1">
@@ -9276,7 +9619,7 @@
         <w:ind w:left="4320" w:hanging="360"/>
       </w:pPr>
       <w:rPr>
-        <w:rFonts w:ascii="Courier New" w:hAnsi="Courier New" w:cs="Courier New" w:hint="default"/>
+        <w:rFonts w:hint="default" w:ascii="Courier New" w:hAnsi="Courier New" w:cs="Courier New"/>
       </w:rPr>
     </w:lvl>
     <w:lvl w:ilvl="5" w:tplc="1C090005" w:tentative="1">
@@ -9288,7 +9631,7 @@
         <w:ind w:left="5040" w:hanging="360"/>
       </w:pPr>
       <w:rPr>
-        <w:rFonts w:ascii="Wingdings" w:hAnsi="Wingdings" w:hint="default"/>
+        <w:rFonts w:hint="default" w:ascii="Wingdings" w:hAnsi="Wingdings"/>
       </w:rPr>
     </w:lvl>
     <w:lvl w:ilvl="6" w:tplc="1C090001" w:tentative="1">
@@ -9300,7 +9643,7 @@
         <w:ind w:left="5760" w:hanging="360"/>
       </w:pPr>
       <w:rPr>
-        <w:rFonts w:ascii="Symbol" w:hAnsi="Symbol" w:hint="default"/>
+        <w:rFonts w:hint="default" w:ascii="Symbol" w:hAnsi="Symbol"/>
       </w:rPr>
     </w:lvl>
     <w:lvl w:ilvl="7" w:tplc="1C090003" w:tentative="1">
@@ -9312,7 +9655,7 @@
         <w:ind w:left="6480" w:hanging="360"/>
       </w:pPr>
       <w:rPr>
-        <w:rFonts w:ascii="Courier New" w:hAnsi="Courier New" w:cs="Courier New" w:hint="default"/>
+        <w:rFonts w:hint="default" w:ascii="Courier New" w:hAnsi="Courier New" w:cs="Courier New"/>
       </w:rPr>
     </w:lvl>
     <w:lvl w:ilvl="8" w:tplc="1C090005" w:tentative="1">
@@ -9324,7 +9667,7 @@
         <w:ind w:left="7200" w:hanging="360"/>
       </w:pPr>
       <w:rPr>
-        <w:rFonts w:ascii="Wingdings" w:hAnsi="Wingdings" w:hint="default"/>
+        <w:rFonts w:hint="default" w:ascii="Wingdings" w:hAnsi="Wingdings"/>
       </w:rPr>
     </w:lvl>
   </w:abstractNum>
@@ -9341,7 +9684,7 @@
         <w:ind w:left="720" w:hanging="360"/>
       </w:pPr>
       <w:rPr>
-        <w:rFonts w:ascii="Symbol" w:hAnsi="Symbol" w:hint="default"/>
+        <w:rFonts w:hint="default" w:ascii="Symbol" w:hAnsi="Symbol"/>
       </w:rPr>
     </w:lvl>
     <w:lvl w:ilvl="1" w:tplc="1C090003" w:tentative="1">
@@ -9353,7 +9696,7 @@
         <w:ind w:left="1440" w:hanging="360"/>
       </w:pPr>
       <w:rPr>
-        <w:rFonts w:ascii="Courier New" w:hAnsi="Courier New" w:cs="Courier New" w:hint="default"/>
+        <w:rFonts w:hint="default" w:ascii="Courier New" w:hAnsi="Courier New" w:cs="Courier New"/>
       </w:rPr>
     </w:lvl>
     <w:lvl w:ilvl="2" w:tplc="1C090005" w:tentative="1">
@@ -9365,7 +9708,7 @@
         <w:ind w:left="2160" w:hanging="360"/>
       </w:pPr>
       <w:rPr>
-        <w:rFonts w:ascii="Wingdings" w:hAnsi="Wingdings" w:hint="default"/>
+        <w:rFonts w:hint="default" w:ascii="Wingdings" w:hAnsi="Wingdings"/>
       </w:rPr>
     </w:lvl>
     <w:lvl w:ilvl="3" w:tplc="1C090001" w:tentative="1">
@@ -9377,7 +9720,7 @@
         <w:ind w:left="2880" w:hanging="360"/>
       </w:pPr>
       <w:rPr>
-        <w:rFonts w:ascii="Symbol" w:hAnsi="Symbol" w:hint="default"/>
+        <w:rFonts w:hint="default" w:ascii="Symbol" w:hAnsi="Symbol"/>
       </w:rPr>
     </w:lvl>
     <w:lvl w:ilvl="4" w:tplc="1C090003" w:tentative="1">
@@ -9389,7 +9732,7 @@
         <w:ind w:left="3600" w:hanging="360"/>
       </w:pPr>
       <w:rPr>
-        <w:rFonts w:ascii="Courier New" w:hAnsi="Courier New" w:cs="Courier New" w:hint="default"/>
+        <w:rFonts w:hint="default" w:ascii="Courier New" w:hAnsi="Courier New" w:cs="Courier New"/>
       </w:rPr>
     </w:lvl>
     <w:lvl w:ilvl="5" w:tplc="1C090005" w:tentative="1">
@@ -9401,7 +9744,7 @@
         <w:ind w:left="4320" w:hanging="360"/>
       </w:pPr>
       <w:rPr>
-        <w:rFonts w:ascii="Wingdings" w:hAnsi="Wingdings" w:hint="default"/>
+        <w:rFonts w:hint="default" w:ascii="Wingdings" w:hAnsi="Wingdings"/>
       </w:rPr>
     </w:lvl>
     <w:lvl w:ilvl="6" w:tplc="1C090001" w:tentative="1">
@@ -9413,7 +9756,7 @@
         <w:ind w:left="5040" w:hanging="360"/>
       </w:pPr>
       <w:rPr>
-        <w:rFonts w:ascii="Symbol" w:hAnsi="Symbol" w:hint="default"/>
+        <w:rFonts w:hint="default" w:ascii="Symbol" w:hAnsi="Symbol"/>
       </w:rPr>
     </w:lvl>
     <w:lvl w:ilvl="7" w:tplc="1C090003" w:tentative="1">
@@ -9425,7 +9768,7 @@
         <w:ind w:left="5760" w:hanging="360"/>
       </w:pPr>
       <w:rPr>
-        <w:rFonts w:ascii="Courier New" w:hAnsi="Courier New" w:cs="Courier New" w:hint="default"/>
+        <w:rFonts w:hint="default" w:ascii="Courier New" w:hAnsi="Courier New" w:cs="Courier New"/>
       </w:rPr>
     </w:lvl>
     <w:lvl w:ilvl="8" w:tplc="1C090005" w:tentative="1">
@@ -9437,7 +9780,7 @@
         <w:ind w:left="6480" w:hanging="360"/>
       </w:pPr>
       <w:rPr>
-        <w:rFonts w:ascii="Wingdings" w:hAnsi="Wingdings" w:hint="default"/>
+        <w:rFonts w:hint="default" w:ascii="Wingdings" w:hAnsi="Wingdings"/>
       </w:rPr>
     </w:lvl>
   </w:abstractNum>
@@ -9540,7 +9883,7 @@
         <w:ind w:left="720" w:hanging="360"/>
       </w:pPr>
       <w:rPr>
-        <w:rFonts w:ascii="Symbol" w:hAnsi="Symbol" w:hint="default"/>
+        <w:rFonts w:hint="default" w:ascii="Symbol" w:hAnsi="Symbol"/>
       </w:rPr>
     </w:lvl>
     <w:lvl w:ilvl="1" w:tplc="1C090003" w:tentative="1">
@@ -9552,7 +9895,7 @@
         <w:ind w:left="1440" w:hanging="360"/>
       </w:pPr>
       <w:rPr>
-        <w:rFonts w:ascii="Courier New" w:hAnsi="Courier New" w:cs="Courier New" w:hint="default"/>
+        <w:rFonts w:hint="default" w:ascii="Courier New" w:hAnsi="Courier New" w:cs="Courier New"/>
       </w:rPr>
     </w:lvl>
     <w:lvl w:ilvl="2" w:tplc="1C090005" w:tentative="1">
@@ -9564,7 +9907,7 @@
         <w:ind w:left="2160" w:hanging="360"/>
       </w:pPr>
       <w:rPr>
-        <w:rFonts w:ascii="Wingdings" w:hAnsi="Wingdings" w:hint="default"/>
+        <w:rFonts w:hint="default" w:ascii="Wingdings" w:hAnsi="Wingdings"/>
       </w:rPr>
     </w:lvl>
     <w:lvl w:ilvl="3" w:tplc="1C090001" w:tentative="1">
@@ -9576,7 +9919,7 @@
         <w:ind w:left="2880" w:hanging="360"/>
       </w:pPr>
       <w:rPr>
-        <w:rFonts w:ascii="Symbol" w:hAnsi="Symbol" w:hint="default"/>
+        <w:rFonts w:hint="default" w:ascii="Symbol" w:hAnsi="Symbol"/>
       </w:rPr>
     </w:lvl>
     <w:lvl w:ilvl="4" w:tplc="1C090003" w:tentative="1">
@@ -9588,7 +9931,7 @@
         <w:ind w:left="3600" w:hanging="360"/>
       </w:pPr>
       <w:rPr>
-        <w:rFonts w:ascii="Courier New" w:hAnsi="Courier New" w:cs="Courier New" w:hint="default"/>
+        <w:rFonts w:hint="default" w:ascii="Courier New" w:hAnsi="Courier New" w:cs="Courier New"/>
       </w:rPr>
     </w:lvl>
     <w:lvl w:ilvl="5" w:tplc="1C090005" w:tentative="1">
@@ -9600,7 +9943,7 @@
         <w:ind w:left="4320" w:hanging="360"/>
       </w:pPr>
       <w:rPr>
-        <w:rFonts w:ascii="Wingdings" w:hAnsi="Wingdings" w:hint="default"/>
+        <w:rFonts w:hint="default" w:ascii="Wingdings" w:hAnsi="Wingdings"/>
       </w:rPr>
     </w:lvl>
     <w:lvl w:ilvl="6" w:tplc="1C090001" w:tentative="1">
@@ -9612,7 +9955,7 @@
         <w:ind w:left="5040" w:hanging="360"/>
       </w:pPr>
       <w:rPr>
-        <w:rFonts w:ascii="Symbol" w:hAnsi="Symbol" w:hint="default"/>
+        <w:rFonts w:hint="default" w:ascii="Symbol" w:hAnsi="Symbol"/>
       </w:rPr>
     </w:lvl>
     <w:lvl w:ilvl="7" w:tplc="1C090003" w:tentative="1">
@@ -9624,7 +9967,7 @@
         <w:ind w:left="5760" w:hanging="360"/>
       </w:pPr>
       <w:rPr>
-        <w:rFonts w:ascii="Courier New" w:hAnsi="Courier New" w:cs="Courier New" w:hint="default"/>
+        <w:rFonts w:hint="default" w:ascii="Courier New" w:hAnsi="Courier New" w:cs="Courier New"/>
       </w:rPr>
     </w:lvl>
     <w:lvl w:ilvl="8" w:tplc="1C090005" w:tentative="1">
@@ -9636,7 +9979,7 @@
         <w:ind w:left="6480" w:hanging="360"/>
       </w:pPr>
       <w:rPr>
-        <w:rFonts w:ascii="Wingdings" w:hAnsi="Wingdings" w:hint="default"/>
+        <w:rFonts w:hint="default" w:ascii="Wingdings" w:hAnsi="Wingdings"/>
       </w:rPr>
     </w:lvl>
   </w:abstractNum>
@@ -9653,7 +9996,7 @@
         <w:ind w:left="720" w:hanging="360"/>
       </w:pPr>
       <w:rPr>
-        <w:rFonts w:ascii="Symbol" w:hAnsi="Symbol" w:hint="default"/>
+        <w:rFonts w:hint="default" w:ascii="Symbol" w:hAnsi="Symbol"/>
       </w:rPr>
     </w:lvl>
     <w:lvl w:ilvl="1" w:tplc="1C090003" w:tentative="1">
@@ -9665,7 +10008,7 @@
         <w:ind w:left="1440" w:hanging="360"/>
       </w:pPr>
       <w:rPr>
-        <w:rFonts w:ascii="Courier New" w:hAnsi="Courier New" w:cs="Courier New" w:hint="default"/>
+        <w:rFonts w:hint="default" w:ascii="Courier New" w:hAnsi="Courier New" w:cs="Courier New"/>
       </w:rPr>
     </w:lvl>
     <w:lvl w:ilvl="2" w:tplc="1C090005" w:tentative="1">
@@ -9677,7 +10020,7 @@
         <w:ind w:left="2160" w:hanging="360"/>
       </w:pPr>
       <w:rPr>
-        <w:rFonts w:ascii="Wingdings" w:hAnsi="Wingdings" w:hint="default"/>
+        <w:rFonts w:hint="default" w:ascii="Wingdings" w:hAnsi="Wingdings"/>
       </w:rPr>
     </w:lvl>
     <w:lvl w:ilvl="3" w:tplc="1C090001" w:tentative="1">
@@ -9689,7 +10032,7 @@
         <w:ind w:left="2880" w:hanging="360"/>
       </w:pPr>
       <w:rPr>
-        <w:rFonts w:ascii="Symbol" w:hAnsi="Symbol" w:hint="default"/>
+        <w:rFonts w:hint="default" w:ascii="Symbol" w:hAnsi="Symbol"/>
       </w:rPr>
     </w:lvl>
     <w:lvl w:ilvl="4" w:tplc="1C090003" w:tentative="1">
@@ -9701,7 +10044,7 @@
         <w:ind w:left="3600" w:hanging="360"/>
       </w:pPr>
       <w:rPr>
-        <w:rFonts w:ascii="Courier New" w:hAnsi="Courier New" w:cs="Courier New" w:hint="default"/>
+        <w:rFonts w:hint="default" w:ascii="Courier New" w:hAnsi="Courier New" w:cs="Courier New"/>
       </w:rPr>
     </w:lvl>
     <w:lvl w:ilvl="5" w:tplc="1C090005" w:tentative="1">
@@ -9713,7 +10056,7 @@
         <w:ind w:left="4320" w:hanging="360"/>
       </w:pPr>
       <w:rPr>
-        <w:rFonts w:ascii="Wingdings" w:hAnsi="Wingdings" w:hint="default"/>
+        <w:rFonts w:hint="default" w:ascii="Wingdings" w:hAnsi="Wingdings"/>
       </w:rPr>
     </w:lvl>
     <w:lvl w:ilvl="6" w:tplc="1C090001" w:tentative="1">
@@ -9725,7 +10068,7 @@
         <w:ind w:left="5040" w:hanging="360"/>
       </w:pPr>
       <w:rPr>
-        <w:rFonts w:ascii="Symbol" w:hAnsi="Symbol" w:hint="default"/>
+        <w:rFonts w:hint="default" w:ascii="Symbol" w:hAnsi="Symbol"/>
       </w:rPr>
     </w:lvl>
     <w:lvl w:ilvl="7" w:tplc="1C090003" w:tentative="1">
@@ -9737,7 +10080,7 @@
         <w:ind w:left="5760" w:hanging="360"/>
       </w:pPr>
       <w:rPr>
-        <w:rFonts w:ascii="Courier New" w:hAnsi="Courier New" w:cs="Courier New" w:hint="default"/>
+        <w:rFonts w:hint="default" w:ascii="Courier New" w:hAnsi="Courier New" w:cs="Courier New"/>
       </w:rPr>
     </w:lvl>
     <w:lvl w:ilvl="8" w:tplc="1C090005" w:tentative="1">
@@ -9749,7 +10092,7 @@
         <w:ind w:left="6480" w:hanging="360"/>
       </w:pPr>
       <w:rPr>
-        <w:rFonts w:ascii="Wingdings" w:hAnsi="Wingdings" w:hint="default"/>
+        <w:rFonts w:hint="default" w:ascii="Wingdings" w:hAnsi="Wingdings"/>
       </w:rPr>
     </w:lvl>
   </w:abstractNum>
@@ -9766,7 +10109,7 @@
         <w:ind w:left="720" w:hanging="360"/>
       </w:pPr>
       <w:rPr>
-        <w:rFonts w:ascii="Symbol" w:hAnsi="Symbol" w:hint="default"/>
+        <w:rFonts w:hint="default" w:ascii="Symbol" w:hAnsi="Symbol"/>
         <w:b/>
       </w:rPr>
     </w:lvl>
@@ -9856,7 +10199,7 @@
         <w:ind w:left="720" w:hanging="360"/>
       </w:pPr>
       <w:rPr>
-        <w:rFonts w:ascii="Symbol" w:hAnsi="Symbol" w:hint="default"/>
+        <w:rFonts w:hint="default" w:ascii="Symbol" w:hAnsi="Symbol"/>
       </w:rPr>
     </w:lvl>
     <w:lvl w:ilvl="1" w:tplc="1C090003" w:tentative="1">
@@ -9868,7 +10211,7 @@
         <w:ind w:left="1440" w:hanging="360"/>
       </w:pPr>
       <w:rPr>
-        <w:rFonts w:ascii="Courier New" w:hAnsi="Courier New" w:cs="Courier New" w:hint="default"/>
+        <w:rFonts w:hint="default" w:ascii="Courier New" w:hAnsi="Courier New" w:cs="Courier New"/>
       </w:rPr>
     </w:lvl>
     <w:lvl w:ilvl="2" w:tplc="1C090005" w:tentative="1">
@@ -9880,7 +10223,7 @@
         <w:ind w:left="2160" w:hanging="360"/>
       </w:pPr>
       <w:rPr>
-        <w:rFonts w:ascii="Wingdings" w:hAnsi="Wingdings" w:hint="default"/>
+        <w:rFonts w:hint="default" w:ascii="Wingdings" w:hAnsi="Wingdings"/>
       </w:rPr>
     </w:lvl>
     <w:lvl w:ilvl="3" w:tplc="1C090001" w:tentative="1">
@@ -9892,7 +10235,7 @@
         <w:ind w:left="2880" w:hanging="360"/>
       </w:pPr>
       <w:rPr>
-        <w:rFonts w:ascii="Symbol" w:hAnsi="Symbol" w:hint="default"/>
+        <w:rFonts w:hint="default" w:ascii="Symbol" w:hAnsi="Symbol"/>
       </w:rPr>
     </w:lvl>
     <w:lvl w:ilvl="4" w:tplc="1C090003" w:tentative="1">
@@ -9904,7 +10247,7 @@
         <w:ind w:left="3600" w:hanging="360"/>
       </w:pPr>
       <w:rPr>
-        <w:rFonts w:ascii="Courier New" w:hAnsi="Courier New" w:cs="Courier New" w:hint="default"/>
+        <w:rFonts w:hint="default" w:ascii="Courier New" w:hAnsi="Courier New" w:cs="Courier New"/>
       </w:rPr>
     </w:lvl>
     <w:lvl w:ilvl="5" w:tplc="1C090005" w:tentative="1">
@@ -9916,7 +10259,7 @@
         <w:ind w:left="4320" w:hanging="360"/>
       </w:pPr>
       <w:rPr>
-        <w:rFonts w:ascii="Wingdings" w:hAnsi="Wingdings" w:hint="default"/>
+        <w:rFonts w:hint="default" w:ascii="Wingdings" w:hAnsi="Wingdings"/>
       </w:rPr>
     </w:lvl>
     <w:lvl w:ilvl="6" w:tplc="1C090001" w:tentative="1">
@@ -9928,7 +10271,7 @@
         <w:ind w:left="5040" w:hanging="360"/>
       </w:pPr>
       <w:rPr>
-        <w:rFonts w:ascii="Symbol" w:hAnsi="Symbol" w:hint="default"/>
+        <w:rFonts w:hint="default" w:ascii="Symbol" w:hAnsi="Symbol"/>
       </w:rPr>
     </w:lvl>
     <w:lvl w:ilvl="7" w:tplc="1C090003" w:tentative="1">
@@ -9940,7 +10283,7 @@
         <w:ind w:left="5760" w:hanging="360"/>
       </w:pPr>
       <w:rPr>
-        <w:rFonts w:ascii="Courier New" w:hAnsi="Courier New" w:cs="Courier New" w:hint="default"/>
+        <w:rFonts w:hint="default" w:ascii="Courier New" w:hAnsi="Courier New" w:cs="Courier New"/>
       </w:rPr>
     </w:lvl>
     <w:lvl w:ilvl="8" w:tplc="1C090005" w:tentative="1">
@@ -9952,7 +10295,7 @@
         <w:ind w:left="6480" w:hanging="360"/>
       </w:pPr>
       <w:rPr>
-        <w:rFonts w:ascii="Wingdings" w:hAnsi="Wingdings" w:hint="default"/>
+        <w:rFonts w:hint="default" w:ascii="Wingdings" w:hAnsi="Wingdings"/>
       </w:rPr>
     </w:lvl>
   </w:abstractNum>
@@ -9969,7 +10312,7 @@
         <w:ind w:left="360" w:hanging="360"/>
       </w:pPr>
       <w:rPr>
-        <w:rFonts w:ascii="Symbol" w:hAnsi="Symbol" w:hint="default"/>
+        <w:rFonts w:hint="default" w:ascii="Symbol" w:hAnsi="Symbol"/>
         <w:b/>
       </w:rPr>
     </w:lvl>
@@ -10059,7 +10402,7 @@
         <w:ind w:left="720" w:hanging="360"/>
       </w:pPr>
       <w:rPr>
-        <w:rFonts w:ascii="Symbol" w:hAnsi="Symbol" w:hint="default"/>
+        <w:rFonts w:hint="default" w:ascii="Symbol" w:hAnsi="Symbol"/>
       </w:rPr>
     </w:lvl>
     <w:lvl w:ilvl="1" w:tplc="1C090003" w:tentative="1">
@@ -10071,7 +10414,7 @@
         <w:ind w:left="1440" w:hanging="360"/>
       </w:pPr>
       <w:rPr>
-        <w:rFonts w:ascii="Courier New" w:hAnsi="Courier New" w:cs="Courier New" w:hint="default"/>
+        <w:rFonts w:hint="default" w:ascii="Courier New" w:hAnsi="Courier New" w:cs="Courier New"/>
       </w:rPr>
     </w:lvl>
     <w:lvl w:ilvl="2" w:tplc="1C090005" w:tentative="1">
@@ -10083,7 +10426,7 @@
         <w:ind w:left="2160" w:hanging="360"/>
       </w:pPr>
       <w:rPr>
-        <w:rFonts w:ascii="Wingdings" w:hAnsi="Wingdings" w:hint="default"/>
+        <w:rFonts w:hint="default" w:ascii="Wingdings" w:hAnsi="Wingdings"/>
       </w:rPr>
     </w:lvl>
     <w:lvl w:ilvl="3" w:tplc="1C090001" w:tentative="1">
@@ -10095,7 +10438,7 @@
         <w:ind w:left="2880" w:hanging="360"/>
       </w:pPr>
       <w:rPr>
-        <w:rFonts w:ascii="Symbol" w:hAnsi="Symbol" w:hint="default"/>
+        <w:rFonts w:hint="default" w:ascii="Symbol" w:hAnsi="Symbol"/>
       </w:rPr>
     </w:lvl>
     <w:lvl w:ilvl="4" w:tplc="1C090003" w:tentative="1">
@@ -10107,7 +10450,7 @@
         <w:ind w:left="3600" w:hanging="360"/>
       </w:pPr>
       <w:rPr>
-        <w:rFonts w:ascii="Courier New" w:hAnsi="Courier New" w:cs="Courier New" w:hint="default"/>
+        <w:rFonts w:hint="default" w:ascii="Courier New" w:hAnsi="Courier New" w:cs="Courier New"/>
       </w:rPr>
     </w:lvl>
     <w:lvl w:ilvl="5" w:tplc="1C090005" w:tentative="1">
@@ -10119,7 +10462,7 @@
         <w:ind w:left="4320" w:hanging="360"/>
       </w:pPr>
       <w:rPr>
-        <w:rFonts w:ascii="Wingdings" w:hAnsi="Wingdings" w:hint="default"/>
+        <w:rFonts w:hint="default" w:ascii="Wingdings" w:hAnsi="Wingdings"/>
       </w:rPr>
     </w:lvl>
     <w:lvl w:ilvl="6" w:tplc="1C090001" w:tentative="1">
@@ -10131,7 +10474,7 @@
         <w:ind w:left="5040" w:hanging="360"/>
       </w:pPr>
       <w:rPr>
-        <w:rFonts w:ascii="Symbol" w:hAnsi="Symbol" w:hint="default"/>
+        <w:rFonts w:hint="default" w:ascii="Symbol" w:hAnsi="Symbol"/>
       </w:rPr>
     </w:lvl>
     <w:lvl w:ilvl="7" w:tplc="1C090003" w:tentative="1">
@@ -10143,7 +10486,7 @@
         <w:ind w:left="5760" w:hanging="360"/>
       </w:pPr>
       <w:rPr>
-        <w:rFonts w:ascii="Courier New" w:hAnsi="Courier New" w:cs="Courier New" w:hint="default"/>
+        <w:rFonts w:hint="default" w:ascii="Courier New" w:hAnsi="Courier New" w:cs="Courier New"/>
       </w:rPr>
     </w:lvl>
     <w:lvl w:ilvl="8" w:tplc="1C090005" w:tentative="1">
@@ -10155,7 +10498,7 @@
         <w:ind w:left="6480" w:hanging="360"/>
       </w:pPr>
       <w:rPr>
-        <w:rFonts w:ascii="Wingdings" w:hAnsi="Wingdings" w:hint="default"/>
+        <w:rFonts w:hint="default" w:ascii="Wingdings" w:hAnsi="Wingdings"/>
       </w:rPr>
     </w:lvl>
   </w:abstractNum>
@@ -10172,7 +10515,7 @@
         <w:ind w:left="720" w:hanging="360"/>
       </w:pPr>
       <w:rPr>
-        <w:rFonts w:ascii="Symbol" w:hAnsi="Symbol" w:hint="default"/>
+        <w:rFonts w:hint="default" w:ascii="Symbol" w:hAnsi="Symbol"/>
         <w:b/>
       </w:rPr>
     </w:lvl>
@@ -10262,7 +10605,7 @@
         <w:ind w:left="720" w:hanging="360"/>
       </w:pPr>
       <w:rPr>
-        <w:rFonts w:ascii="Symbol" w:hAnsi="Symbol" w:hint="default"/>
+        <w:rFonts w:hint="default" w:ascii="Symbol" w:hAnsi="Symbol"/>
       </w:rPr>
     </w:lvl>
     <w:lvl w:ilvl="1" w:tplc="1C090003" w:tentative="1">
@@ -10274,7 +10617,7 @@
         <w:ind w:left="1440" w:hanging="360"/>
       </w:pPr>
       <w:rPr>
-        <w:rFonts w:ascii="Courier New" w:hAnsi="Courier New" w:cs="Courier New" w:hint="default"/>
+        <w:rFonts w:hint="default" w:ascii="Courier New" w:hAnsi="Courier New" w:cs="Courier New"/>
       </w:rPr>
     </w:lvl>
     <w:lvl w:ilvl="2" w:tplc="1C090005" w:tentative="1">
@@ -10286,7 +10629,7 @@
         <w:ind w:left="2160" w:hanging="360"/>
       </w:pPr>
       <w:rPr>
-        <w:rFonts w:ascii="Wingdings" w:hAnsi="Wingdings" w:hint="default"/>
+        <w:rFonts w:hint="default" w:ascii="Wingdings" w:hAnsi="Wingdings"/>
       </w:rPr>
     </w:lvl>
     <w:lvl w:ilvl="3" w:tplc="1C090001" w:tentative="1">
@@ -10298,7 +10641,7 @@
         <w:ind w:left="2880" w:hanging="360"/>
       </w:pPr>
       <w:rPr>
-        <w:rFonts w:ascii="Symbol" w:hAnsi="Symbol" w:hint="default"/>
+        <w:rFonts w:hint="default" w:ascii="Symbol" w:hAnsi="Symbol"/>
       </w:rPr>
     </w:lvl>
     <w:lvl w:ilvl="4" w:tplc="1C090003" w:tentative="1">
@@ -10310,7 +10653,7 @@
         <w:ind w:left="3600" w:hanging="360"/>
       </w:pPr>
       <w:rPr>
-        <w:rFonts w:ascii="Courier New" w:hAnsi="Courier New" w:cs="Courier New" w:hint="default"/>
+        <w:rFonts w:hint="default" w:ascii="Courier New" w:hAnsi="Courier New" w:cs="Courier New"/>
       </w:rPr>
     </w:lvl>
     <w:lvl w:ilvl="5" w:tplc="1C090005" w:tentative="1">
@@ -10322,7 +10665,7 @@
         <w:ind w:left="4320" w:hanging="360"/>
       </w:pPr>
       <w:rPr>
-        <w:rFonts w:ascii="Wingdings" w:hAnsi="Wingdings" w:hint="default"/>
+        <w:rFonts w:hint="default" w:ascii="Wingdings" w:hAnsi="Wingdings"/>
       </w:rPr>
     </w:lvl>
     <w:lvl w:ilvl="6" w:tplc="1C090001" w:tentative="1">
@@ -10334,7 +10677,7 @@
         <w:ind w:left="5040" w:hanging="360"/>
       </w:pPr>
       <w:rPr>
-        <w:rFonts w:ascii="Symbol" w:hAnsi="Symbol" w:hint="default"/>
+        <w:rFonts w:hint="default" w:ascii="Symbol" w:hAnsi="Symbol"/>
       </w:rPr>
     </w:lvl>
     <w:lvl w:ilvl="7" w:tplc="1C090003" w:tentative="1">
@@ -10346,7 +10689,7 @@
         <w:ind w:left="5760" w:hanging="360"/>
       </w:pPr>
       <w:rPr>
-        <w:rFonts w:ascii="Courier New" w:hAnsi="Courier New" w:cs="Courier New" w:hint="default"/>
+        <w:rFonts w:hint="default" w:ascii="Courier New" w:hAnsi="Courier New" w:cs="Courier New"/>
       </w:rPr>
     </w:lvl>
     <w:lvl w:ilvl="8" w:tplc="1C090005" w:tentative="1">
@@ -10358,7 +10701,7 @@
         <w:ind w:left="6480" w:hanging="360"/>
       </w:pPr>
       <w:rPr>
-        <w:rFonts w:ascii="Wingdings" w:hAnsi="Wingdings" w:hint="default"/>
+        <w:rFonts w:hint="default" w:ascii="Wingdings" w:hAnsi="Wingdings"/>
       </w:rPr>
     </w:lvl>
   </w:abstractNum>
@@ -10375,7 +10718,7 @@
         <w:ind w:left="720" w:hanging="360"/>
       </w:pPr>
       <w:rPr>
-        <w:rFonts w:ascii="Symbol" w:hAnsi="Symbol" w:hint="default"/>
+        <w:rFonts w:hint="default" w:ascii="Symbol" w:hAnsi="Symbol"/>
       </w:rPr>
     </w:lvl>
     <w:lvl w:ilvl="1" w:tplc="1C090003" w:tentative="1">
@@ -10387,7 +10730,7 @@
         <w:ind w:left="1440" w:hanging="360"/>
       </w:pPr>
       <w:rPr>
-        <w:rFonts w:ascii="Courier New" w:hAnsi="Courier New" w:cs="Courier New" w:hint="default"/>
+        <w:rFonts w:hint="default" w:ascii="Courier New" w:hAnsi="Courier New" w:cs="Courier New"/>
       </w:rPr>
     </w:lvl>
     <w:lvl w:ilvl="2" w:tplc="1C090005" w:tentative="1">
@@ -10399,7 +10742,7 @@
         <w:ind w:left="2160" w:hanging="360"/>
       </w:pPr>
       <w:rPr>
-        <w:rFonts w:ascii="Wingdings" w:hAnsi="Wingdings" w:hint="default"/>
+        <w:rFonts w:hint="default" w:ascii="Wingdings" w:hAnsi="Wingdings"/>
       </w:rPr>
     </w:lvl>
     <w:lvl w:ilvl="3" w:tplc="1C090001" w:tentative="1">
@@ -10411,7 +10754,7 @@
         <w:ind w:left="2880" w:hanging="360"/>
       </w:pPr>
       <w:rPr>
-        <w:rFonts w:ascii="Symbol" w:hAnsi="Symbol" w:hint="default"/>
+        <w:rFonts w:hint="default" w:ascii="Symbol" w:hAnsi="Symbol"/>
       </w:rPr>
     </w:lvl>
     <w:lvl w:ilvl="4" w:tplc="1C090003" w:tentative="1">
@@ -10423,7 +10766,7 @@
         <w:ind w:left="3600" w:hanging="360"/>
       </w:pPr>
       <w:rPr>
-        <w:rFonts w:ascii="Courier New" w:hAnsi="Courier New" w:cs="Courier New" w:hint="default"/>
+        <w:rFonts w:hint="default" w:ascii="Courier New" w:hAnsi="Courier New" w:cs="Courier New"/>
       </w:rPr>
     </w:lvl>
     <w:lvl w:ilvl="5" w:tplc="1C090005" w:tentative="1">
@@ -10435,7 +10778,7 @@
         <w:ind w:left="4320" w:hanging="360"/>
       </w:pPr>
       <w:rPr>
-        <w:rFonts w:ascii="Wingdings" w:hAnsi="Wingdings" w:hint="default"/>
+        <w:rFonts w:hint="default" w:ascii="Wingdings" w:hAnsi="Wingdings"/>
       </w:rPr>
     </w:lvl>
     <w:lvl w:ilvl="6" w:tplc="1C090001" w:tentative="1">
@@ -10447,7 +10790,7 @@
         <w:ind w:left="5040" w:hanging="360"/>
       </w:pPr>
       <w:rPr>
-        <w:rFonts w:ascii="Symbol" w:hAnsi="Symbol" w:hint="default"/>
+        <w:rFonts w:hint="default" w:ascii="Symbol" w:hAnsi="Symbol"/>
       </w:rPr>
     </w:lvl>
     <w:lvl w:ilvl="7" w:tplc="1C090003" w:tentative="1">
@@ -10459,7 +10802,7 @@
         <w:ind w:left="5760" w:hanging="360"/>
       </w:pPr>
       <w:rPr>
-        <w:rFonts w:ascii="Courier New" w:hAnsi="Courier New" w:cs="Courier New" w:hint="default"/>
+        <w:rFonts w:hint="default" w:ascii="Courier New" w:hAnsi="Courier New" w:cs="Courier New"/>
       </w:rPr>
     </w:lvl>
     <w:lvl w:ilvl="8" w:tplc="1C090005" w:tentative="1">
@@ -10471,7 +10814,7 @@
         <w:ind w:left="6480" w:hanging="360"/>
       </w:pPr>
       <w:rPr>
-        <w:rFonts w:ascii="Wingdings" w:hAnsi="Wingdings" w:hint="default"/>
+        <w:rFonts w:hint="default" w:ascii="Wingdings" w:hAnsi="Wingdings"/>
       </w:rPr>
     </w:lvl>
   </w:abstractNum>
@@ -10488,7 +10831,7 @@
         <w:ind w:left="720" w:hanging="360"/>
       </w:pPr>
       <w:rPr>
-        <w:rFonts w:ascii="Symbol" w:hAnsi="Symbol" w:hint="default"/>
+        <w:rFonts w:hint="default" w:ascii="Symbol" w:hAnsi="Symbol"/>
       </w:rPr>
     </w:lvl>
     <w:lvl w:ilvl="1" w:tplc="1C090003" w:tentative="1">
@@ -10500,7 +10843,7 @@
         <w:ind w:left="1440" w:hanging="360"/>
       </w:pPr>
       <w:rPr>
-        <w:rFonts w:ascii="Courier New" w:hAnsi="Courier New" w:cs="Courier New" w:hint="default"/>
+        <w:rFonts w:hint="default" w:ascii="Courier New" w:hAnsi="Courier New" w:cs="Courier New"/>
       </w:rPr>
     </w:lvl>
     <w:lvl w:ilvl="2" w:tplc="1C090005" w:tentative="1">
@@ -10512,7 +10855,7 @@
         <w:ind w:left="2160" w:hanging="360"/>
       </w:pPr>
       <w:rPr>
-        <w:rFonts w:ascii="Wingdings" w:hAnsi="Wingdings" w:hint="default"/>
+        <w:rFonts w:hint="default" w:ascii="Wingdings" w:hAnsi="Wingdings"/>
       </w:rPr>
     </w:lvl>
     <w:lvl w:ilvl="3" w:tplc="1C090001" w:tentative="1">
@@ -10524,7 +10867,7 @@
         <w:ind w:left="2880" w:hanging="360"/>
       </w:pPr>
       <w:rPr>
-        <w:rFonts w:ascii="Symbol" w:hAnsi="Symbol" w:hint="default"/>
+        <w:rFonts w:hint="default" w:ascii="Symbol" w:hAnsi="Symbol"/>
       </w:rPr>
     </w:lvl>
     <w:lvl w:ilvl="4" w:tplc="1C090003" w:tentative="1">
@@ -10536,7 +10879,7 @@
         <w:ind w:left="3600" w:hanging="360"/>
       </w:pPr>
       <w:rPr>
-        <w:rFonts w:ascii="Courier New" w:hAnsi="Courier New" w:cs="Courier New" w:hint="default"/>
+        <w:rFonts w:hint="default" w:ascii="Courier New" w:hAnsi="Courier New" w:cs="Courier New"/>
       </w:rPr>
     </w:lvl>
     <w:lvl w:ilvl="5" w:tplc="1C090005" w:tentative="1">
@@ -10548,7 +10891,7 @@
         <w:ind w:left="4320" w:hanging="360"/>
       </w:pPr>
       <w:rPr>
-        <w:rFonts w:ascii="Wingdings" w:hAnsi="Wingdings" w:hint="default"/>
+        <w:rFonts w:hint="default" w:ascii="Wingdings" w:hAnsi="Wingdings"/>
       </w:rPr>
     </w:lvl>
     <w:lvl w:ilvl="6" w:tplc="1C090001" w:tentative="1">
@@ -10560,7 +10903,7 @@
         <w:ind w:left="5040" w:hanging="360"/>
       </w:pPr>
       <w:rPr>
-        <w:rFonts w:ascii="Symbol" w:hAnsi="Symbol" w:hint="default"/>
+        <w:rFonts w:hint="default" w:ascii="Symbol" w:hAnsi="Symbol"/>
       </w:rPr>
     </w:lvl>
     <w:lvl w:ilvl="7" w:tplc="1C090003" w:tentative="1">
@@ -10572,7 +10915,7 @@
         <w:ind w:left="5760" w:hanging="360"/>
       </w:pPr>
       <w:rPr>
-        <w:rFonts w:ascii="Courier New" w:hAnsi="Courier New" w:cs="Courier New" w:hint="default"/>
+        <w:rFonts w:hint="default" w:ascii="Courier New" w:hAnsi="Courier New" w:cs="Courier New"/>
       </w:rPr>
     </w:lvl>
     <w:lvl w:ilvl="8" w:tplc="1C090005" w:tentative="1">
@@ -10584,7 +10927,7 @@
         <w:ind w:left="6480" w:hanging="360"/>
       </w:pPr>
       <w:rPr>
-        <w:rFonts w:ascii="Wingdings" w:hAnsi="Wingdings" w:hint="default"/>
+        <w:rFonts w:hint="default" w:ascii="Wingdings" w:hAnsi="Wingdings"/>
       </w:rPr>
     </w:lvl>
   </w:abstractNum>
@@ -10601,7 +10944,7 @@
         <w:ind w:left="720" w:hanging="360"/>
       </w:pPr>
       <w:rPr>
-        <w:rFonts w:ascii="Symbol" w:hAnsi="Symbol" w:hint="default"/>
+        <w:rFonts w:hint="default" w:ascii="Symbol" w:hAnsi="Symbol"/>
       </w:rPr>
     </w:lvl>
     <w:lvl w:ilvl="1" w:tplc="1C090003" w:tentative="1">
@@ -10613,7 +10956,7 @@
         <w:ind w:left="1440" w:hanging="360"/>
       </w:pPr>
       <w:rPr>
-        <w:rFonts w:ascii="Courier New" w:hAnsi="Courier New" w:cs="Courier New" w:hint="default"/>
+        <w:rFonts w:hint="default" w:ascii="Courier New" w:hAnsi="Courier New" w:cs="Courier New"/>
       </w:rPr>
     </w:lvl>
     <w:lvl w:ilvl="2" w:tplc="1C090005" w:tentative="1">
@@ -10625,7 +10968,7 @@
         <w:ind w:left="2160" w:hanging="360"/>
       </w:pPr>
       <w:rPr>
-        <w:rFonts w:ascii="Wingdings" w:hAnsi="Wingdings" w:hint="default"/>
+        <w:rFonts w:hint="default" w:ascii="Wingdings" w:hAnsi="Wingdings"/>
       </w:rPr>
     </w:lvl>
     <w:lvl w:ilvl="3" w:tplc="1C090001" w:tentative="1">
@@ -10637,7 +10980,7 @@
         <w:ind w:left="2880" w:hanging="360"/>
       </w:pPr>
       <w:rPr>
-        <w:rFonts w:ascii="Symbol" w:hAnsi="Symbol" w:hint="default"/>
+        <w:rFonts w:hint="default" w:ascii="Symbol" w:hAnsi="Symbol"/>
       </w:rPr>
     </w:lvl>
     <w:lvl w:ilvl="4" w:tplc="1C090003" w:tentative="1">
@@ -10649,7 +10992,7 @@
         <w:ind w:left="3600" w:hanging="360"/>
       </w:pPr>
       <w:rPr>
-        <w:rFonts w:ascii="Courier New" w:hAnsi="Courier New" w:cs="Courier New" w:hint="default"/>
+        <w:rFonts w:hint="default" w:ascii="Courier New" w:hAnsi="Courier New" w:cs="Courier New"/>
       </w:rPr>
     </w:lvl>
     <w:lvl w:ilvl="5" w:tplc="1C090005" w:tentative="1">
@@ -10661,7 +11004,7 @@
         <w:ind w:left="4320" w:hanging="360"/>
       </w:pPr>
       <w:rPr>
-        <w:rFonts w:ascii="Wingdings" w:hAnsi="Wingdings" w:hint="default"/>
+        <w:rFonts w:hint="default" w:ascii="Wingdings" w:hAnsi="Wingdings"/>
       </w:rPr>
     </w:lvl>
     <w:lvl w:ilvl="6" w:tplc="1C090001" w:tentative="1">
@@ -10673,7 +11016,7 @@
         <w:ind w:left="5040" w:hanging="360"/>
       </w:pPr>
       <w:rPr>
-        <w:rFonts w:ascii="Symbol" w:hAnsi="Symbol" w:hint="default"/>
+        <w:rFonts w:hint="default" w:ascii="Symbol" w:hAnsi="Symbol"/>
       </w:rPr>
     </w:lvl>
     <w:lvl w:ilvl="7" w:tplc="1C090003" w:tentative="1">
@@ -10685,7 +11028,7 @@
         <w:ind w:left="5760" w:hanging="360"/>
       </w:pPr>
       <w:rPr>
-        <w:rFonts w:ascii="Courier New" w:hAnsi="Courier New" w:cs="Courier New" w:hint="default"/>
+        <w:rFonts w:hint="default" w:ascii="Courier New" w:hAnsi="Courier New" w:cs="Courier New"/>
       </w:rPr>
     </w:lvl>
     <w:lvl w:ilvl="8" w:tplc="1C090005" w:tentative="1">
@@ -10697,7 +11040,7 @@
         <w:ind w:left="6480" w:hanging="360"/>
       </w:pPr>
       <w:rPr>
-        <w:rFonts w:ascii="Wingdings" w:hAnsi="Wingdings" w:hint="default"/>
+        <w:rFonts w:hint="default" w:ascii="Wingdings" w:hAnsi="Wingdings"/>
       </w:rPr>
     </w:lvl>
   </w:abstractNum>
@@ -10846,11 +11189,11 @@
 </file>
 
 <file path=word/styles.xml><?xml version="1.0" encoding="utf-8"?>
-<w:styles xmlns:mc="http://schemas.openxmlformats.org/markup-compatibility/2006" xmlns:r="http://schemas.openxmlformats.org/officeDocument/2006/relationships" xmlns:w="http://schemas.openxmlformats.org/wordprocessingml/2006/main" xmlns:w14="http://schemas.microsoft.com/office/word/2010/wordml" xmlns:w15="http://schemas.microsoft.com/office/word/2012/wordml" xmlns:w16cex="http://schemas.microsoft.com/office/word/2018/wordml/cex" xmlns:w16cid="http://schemas.microsoft.com/office/word/2016/wordml/cid" xmlns:w16="http://schemas.microsoft.com/office/word/2018/wordml" xmlns:w16du="http://schemas.microsoft.com/office/word/2023/wordml/word16du" xmlns:w16sdtdh="http://schemas.microsoft.com/office/word/2020/wordml/sdtdatahash" xmlns:w16sdtfl="http://schemas.microsoft.com/office/word/2024/wordml/sdtformatlock" xmlns:w16se="http://schemas.microsoft.com/office/word/2015/wordml/symex" mc:Ignorable="w14 w15 w16se w16cid w16 w16cex w16sdtdh w16sdtfl w16du">
+<w:styles xmlns:wp14="http://schemas.microsoft.com/office/word/2010/wordprocessingDrawing" xmlns:mc="http://schemas.openxmlformats.org/markup-compatibility/2006" xmlns:r="http://schemas.openxmlformats.org/officeDocument/2006/relationships" xmlns:w="http://schemas.openxmlformats.org/wordprocessingml/2006/main" xmlns:w14="http://schemas.microsoft.com/office/word/2010/wordml" xmlns:w15="http://schemas.microsoft.com/office/word/2012/wordml" xmlns:w16cex="http://schemas.microsoft.com/office/word/2018/wordml/cex" xmlns:w16cid="http://schemas.microsoft.com/office/word/2016/wordml/cid" xmlns:w16="http://schemas.microsoft.com/office/word/2018/wordml" xmlns:w16du="http://schemas.microsoft.com/office/word/2023/wordml/word16du" xmlns:w16sdtdh="http://schemas.microsoft.com/office/word/2020/wordml/sdtdatahash" xmlns:w16sdtfl="http://schemas.microsoft.com/office/word/2024/wordml/sdtformatlock" xmlns:w16se="http://schemas.microsoft.com/office/word/2015/wordml/symex" mc:Ignorable="w14 w15 w16se w16cid w16 w16cex w16sdtdh w16sdtfl w16du wp14">
   <w:docDefaults>
     <w:rPrDefault>
       <w:rPr>
-        <w:rFonts w:asciiTheme="minorHAnsi" w:eastAsiaTheme="minorHAnsi" w:hAnsiTheme="minorHAnsi" w:cstheme="minorBidi"/>
+        <w:rFonts w:asciiTheme="minorHAnsi" w:hAnsiTheme="minorHAnsi" w:eastAsiaTheme="minorHAnsi" w:cstheme="minorBidi"/>
         <w:kern w:val="2"/>
         <w:sz w:val="24"/>
         <w:szCs w:val="24"/>
@@ -10867,14 +11210,14 @@
   <w:latentStyles w:defLockedState="0" w:defUIPriority="99" w:defSemiHidden="0" w:defUnhideWhenUsed="0" w:defQFormat="0" w:count="376">
     <w:lsdException w:name="Normal" w:uiPriority="0" w:qFormat="1"/>
     <w:lsdException w:name="heading 1" w:uiPriority="9" w:qFormat="1"/>
-    <w:lsdException w:name="heading 2" w:semiHidden="1" w:uiPriority="9" w:unhideWhenUsed="1" w:qFormat="1"/>
-    <w:lsdException w:name="heading 3" w:semiHidden="1" w:uiPriority="9" w:unhideWhenUsed="1" w:qFormat="1"/>
-    <w:lsdException w:name="heading 4" w:semiHidden="1" w:uiPriority="9" w:unhideWhenUsed="1" w:qFormat="1"/>
-    <w:lsdException w:name="heading 5" w:semiHidden="1" w:uiPriority="9" w:unhideWhenUsed="1" w:qFormat="1"/>
-    <w:lsdException w:name="heading 6" w:semiHidden="1" w:uiPriority="9" w:unhideWhenUsed="1" w:qFormat="1"/>
-    <w:lsdException w:name="heading 7" w:semiHidden="1" w:uiPriority="9" w:unhideWhenUsed="1" w:qFormat="1"/>
-    <w:lsdException w:name="heading 8" w:semiHidden="1" w:uiPriority="9" w:unhideWhenUsed="1" w:qFormat="1"/>
-    <w:lsdException w:name="heading 9" w:semiHidden="1" w:uiPriority="9" w:unhideWhenUsed="1" w:qFormat="1"/>
+    <w:lsdException w:name="heading 2" w:uiPriority="9" w:semiHidden="1" w:unhideWhenUsed="1" w:qFormat="1"/>
+    <w:lsdException w:name="heading 3" w:uiPriority="9" w:semiHidden="1" w:unhideWhenUsed="1" w:qFormat="1"/>
+    <w:lsdException w:name="heading 4" w:uiPriority="9" w:semiHidden="1" w:unhideWhenUsed="1" w:qFormat="1"/>
+    <w:lsdException w:name="heading 5" w:uiPriority="9" w:semiHidden="1" w:unhideWhenUsed="1" w:qFormat="1"/>
+    <w:lsdException w:name="heading 6" w:uiPriority="9" w:semiHidden="1" w:unhideWhenUsed="1" w:qFormat="1"/>
+    <w:lsdException w:name="heading 7" w:uiPriority="9" w:semiHidden="1" w:unhideWhenUsed="1" w:qFormat="1"/>
+    <w:lsdException w:name="heading 8" w:uiPriority="9" w:semiHidden="1" w:unhideWhenUsed="1" w:qFormat="1"/>
+    <w:lsdException w:name="heading 9" w:uiPriority="9" w:semiHidden="1" w:unhideWhenUsed="1" w:qFormat="1"/>
     <w:lsdException w:name="index 1" w:semiHidden="1" w:unhideWhenUsed="1"/>
     <w:lsdException w:name="index 2" w:semiHidden="1" w:unhideWhenUsed="1"/>
     <w:lsdException w:name="index 3" w:semiHidden="1" w:unhideWhenUsed="1"/>
@@ -10884,22 +11227,22 @@
     <w:lsdException w:name="index 7" w:semiHidden="1" w:unhideWhenUsed="1"/>
     <w:lsdException w:name="index 8" w:semiHidden="1" w:unhideWhenUsed="1"/>
     <w:lsdException w:name="index 9" w:semiHidden="1" w:unhideWhenUsed="1"/>
-    <w:lsdException w:name="toc 1" w:semiHidden="1" w:uiPriority="39" w:unhideWhenUsed="1"/>
-    <w:lsdException w:name="toc 2" w:semiHidden="1" w:uiPriority="39" w:unhideWhenUsed="1"/>
-    <w:lsdException w:name="toc 3" w:semiHidden="1" w:uiPriority="39" w:unhideWhenUsed="1"/>
-    <w:lsdException w:name="toc 4" w:semiHidden="1" w:uiPriority="39" w:unhideWhenUsed="1"/>
-    <w:lsdException w:name="toc 5" w:semiHidden="1" w:uiPriority="39" w:unhideWhenUsed="1"/>
-    <w:lsdException w:name="toc 6" w:semiHidden="1" w:uiPriority="39" w:unhideWhenUsed="1"/>
-    <w:lsdException w:name="toc 7" w:semiHidden="1" w:uiPriority="39" w:unhideWhenUsed="1"/>
-    <w:lsdException w:name="toc 8" w:semiHidden="1" w:uiPriority="39" w:unhideWhenUsed="1"/>
-    <w:lsdException w:name="toc 9" w:semiHidden="1" w:uiPriority="39" w:unhideWhenUsed="1"/>
+    <w:lsdException w:name="toc 1" w:uiPriority="39" w:semiHidden="1" w:unhideWhenUsed="1"/>
+    <w:lsdException w:name="toc 2" w:uiPriority="39" w:semiHidden="1" w:unhideWhenUsed="1"/>
+    <w:lsdException w:name="toc 3" w:uiPriority="39" w:semiHidden="1" w:unhideWhenUsed="1"/>
+    <w:lsdException w:name="toc 4" w:uiPriority="39" w:semiHidden="1" w:unhideWhenUsed="1"/>
+    <w:lsdException w:name="toc 5" w:uiPriority="39" w:semiHidden="1" w:unhideWhenUsed="1"/>
+    <w:lsdException w:name="toc 6" w:uiPriority="39" w:semiHidden="1" w:unhideWhenUsed="1"/>
+    <w:lsdException w:name="toc 7" w:uiPriority="39" w:semiHidden="1" w:unhideWhenUsed="1"/>
+    <w:lsdException w:name="toc 8" w:uiPriority="39" w:semiHidden="1" w:unhideWhenUsed="1"/>
+    <w:lsdException w:name="toc 9" w:uiPriority="39" w:semiHidden="1" w:unhideWhenUsed="1"/>
     <w:lsdException w:name="Normal Indent" w:semiHidden="1" w:unhideWhenUsed="1"/>
     <w:lsdException w:name="footnote text" w:semiHidden="1" w:unhideWhenUsed="1"/>
     <w:lsdException w:name="annotation text" w:semiHidden="1" w:unhideWhenUsed="1"/>
     <w:lsdException w:name="header" w:semiHidden="1" w:unhideWhenUsed="1"/>
     <w:lsdException w:name="footer" w:semiHidden="1" w:unhideWhenUsed="1"/>
     <w:lsdException w:name="index heading" w:semiHidden="1" w:unhideWhenUsed="1"/>
-    <w:lsdException w:name="caption" w:semiHidden="1" w:uiPriority="35" w:unhideWhenUsed="1" w:qFormat="1"/>
+    <w:lsdException w:name="caption" w:uiPriority="35" w:semiHidden="1" w:unhideWhenUsed="1" w:qFormat="1"/>
     <w:lsdException w:name="table of figures" w:semiHidden="1" w:unhideWhenUsed="1"/>
     <w:lsdException w:name="envelope address" w:semiHidden="1" w:unhideWhenUsed="1"/>
     <w:lsdException w:name="envelope return" w:semiHidden="1" w:unhideWhenUsed="1"/>
@@ -10930,7 +11273,7 @@
     <w:lsdException w:name="Title" w:uiPriority="10" w:qFormat="1"/>
     <w:lsdException w:name="Closing" w:semiHidden="1" w:unhideWhenUsed="1"/>
     <w:lsdException w:name="Signature" w:semiHidden="1" w:unhideWhenUsed="1"/>
-    <w:lsdException w:name="Default Paragraph Font" w:semiHidden="1" w:uiPriority="1" w:unhideWhenUsed="1"/>
+    <w:lsdException w:name="Default Paragraph Font" w:uiPriority="1" w:semiHidden="1" w:unhideWhenUsed="1"/>
     <w:lsdException w:name="Body Text" w:semiHidden="1" w:unhideWhenUsed="1"/>
     <w:lsdException w:name="Body Text Indent" w:semiHidden="1" w:unhideWhenUsed="1"/>
     <w:lsdException w:name="List Continue" w:semiHidden="1" w:unhideWhenUsed="1"/>
@@ -11130,8 +11473,8 @@
     <w:lsdException w:name="Subtle Reference" w:uiPriority="31" w:qFormat="1"/>
     <w:lsdException w:name="Intense Reference" w:uiPriority="32" w:qFormat="1"/>
     <w:lsdException w:name="Book Title" w:uiPriority="33" w:qFormat="1"/>
-    <w:lsdException w:name="Bibliography" w:semiHidden="1" w:uiPriority="37" w:unhideWhenUsed="1"/>
-    <w:lsdException w:name="TOC Heading" w:semiHidden="1" w:uiPriority="39" w:unhideWhenUsed="1" w:qFormat="1"/>
+    <w:lsdException w:name="Bibliography" w:uiPriority="37" w:semiHidden="1" w:unhideWhenUsed="1"/>
+    <w:lsdException w:name="TOC Heading" w:uiPriority="39" w:semiHidden="1" w:unhideWhenUsed="1" w:qFormat="1"/>
     <w:lsdException w:name="Plain Table 1" w:uiPriority="41"/>
     <w:lsdException w:name="Plain Table 2" w:uiPriority="42"/>
     <w:lsdException w:name="Plain Table 3" w:uiPriority="43"/>
@@ -11242,7 +11585,7 @@
     <w:lsdException w:name="Unresolved Mention" w:semiHidden="1" w:unhideWhenUsed="1"/>
     <w:lsdException w:name="Smart Link" w:semiHidden="1" w:unhideWhenUsed="1"/>
   </w:latentStyles>
-  <w:style w:type="paragraph" w:default="1" w:styleId="Normal">
+  <w:style w:type="paragraph" w:styleId="Normal" w:default="1">
     <w:name w:val="Normal"/>
     <w:qFormat/>
   </w:style>
@@ -11261,7 +11604,7 @@
       <w:outlineLvl w:val="0"/>
     </w:pPr>
     <w:rPr>
-      <w:rFonts w:asciiTheme="majorHAnsi" w:eastAsiaTheme="majorEastAsia" w:hAnsiTheme="majorHAnsi" w:cstheme="majorBidi"/>
+      <w:rFonts w:asciiTheme="majorHAnsi" w:hAnsiTheme="majorHAnsi" w:eastAsiaTheme="majorEastAsia" w:cstheme="majorBidi"/>
       <w:color w:val="0F4761" w:themeColor="accent1" w:themeShade="BF"/>
       <w:sz w:val="40"/>
       <w:szCs w:val="40"/>
@@ -11283,7 +11626,7 @@
       <w:outlineLvl w:val="1"/>
     </w:pPr>
     <w:rPr>
-      <w:rFonts w:asciiTheme="majorHAnsi" w:eastAsiaTheme="majorEastAsia" w:hAnsiTheme="majorHAnsi" w:cstheme="majorBidi"/>
+      <w:rFonts w:asciiTheme="majorHAnsi" w:hAnsiTheme="majorHAnsi" w:eastAsiaTheme="majorEastAsia" w:cstheme="majorBidi"/>
       <w:color w:val="0F4761" w:themeColor="accent1" w:themeShade="BF"/>
       <w:sz w:val="32"/>
       <w:szCs w:val="32"/>
@@ -11441,13 +11784,13 @@
       <w:color w:val="272727" w:themeColor="text1" w:themeTint="D8"/>
     </w:rPr>
   </w:style>
-  <w:style w:type="character" w:default="1" w:styleId="DefaultParagraphFont">
+  <w:style w:type="character" w:styleId="DefaultParagraphFont" w:default="1">
     <w:name w:val="Default Paragraph Font"/>
     <w:uiPriority w:val="1"/>
     <w:semiHidden/>
     <w:unhideWhenUsed/>
   </w:style>
-  <w:style w:type="table" w:default="1" w:styleId="TableNormal">
+  <w:style w:type="table" w:styleId="TableNormal" w:default="1">
     <w:name w:val="Normal Table"/>
     <w:uiPriority w:val="99"/>
     <w:semiHidden/>
@@ -11462,39 +11805,39 @@
       </w:tblCellMar>
     </w:tblPr>
   </w:style>
-  <w:style w:type="numbering" w:default="1" w:styleId="NoList">
+  <w:style w:type="numbering" w:styleId="NoList" w:default="1">
     <w:name w:val="No List"/>
     <w:uiPriority w:val="99"/>
     <w:semiHidden/>
     <w:unhideWhenUsed/>
   </w:style>
-  <w:style w:type="character" w:customStyle="1" w:styleId="Heading1Char">
+  <w:style w:type="character" w:styleId="Heading1Char" w:customStyle="1">
     <w:name w:val="Heading 1 Char"/>
     <w:basedOn w:val="DefaultParagraphFont"/>
     <w:link w:val="Heading1"/>
     <w:uiPriority w:val="9"/>
     <w:rsid w:val="00590662"/>
     <w:rPr>
-      <w:rFonts w:asciiTheme="majorHAnsi" w:eastAsiaTheme="majorEastAsia" w:hAnsiTheme="majorHAnsi" w:cstheme="majorBidi"/>
+      <w:rFonts w:asciiTheme="majorHAnsi" w:hAnsiTheme="majorHAnsi" w:eastAsiaTheme="majorEastAsia" w:cstheme="majorBidi"/>
       <w:color w:val="0F4761" w:themeColor="accent1" w:themeShade="BF"/>
       <w:sz w:val="40"/>
       <w:szCs w:val="40"/>
     </w:rPr>
   </w:style>
-  <w:style w:type="character" w:customStyle="1" w:styleId="Heading2Char">
+  <w:style w:type="character" w:styleId="Heading2Char" w:customStyle="1">
     <w:name w:val="Heading 2 Char"/>
     <w:basedOn w:val="DefaultParagraphFont"/>
     <w:link w:val="Heading2"/>
     <w:uiPriority w:val="9"/>
     <w:rsid w:val="00590662"/>
     <w:rPr>
-      <w:rFonts w:asciiTheme="majorHAnsi" w:eastAsiaTheme="majorEastAsia" w:hAnsiTheme="majorHAnsi" w:cstheme="majorBidi"/>
+      <w:rFonts w:asciiTheme="majorHAnsi" w:hAnsiTheme="majorHAnsi" w:eastAsiaTheme="majorEastAsia" w:cstheme="majorBidi"/>
       <w:color w:val="0F4761" w:themeColor="accent1" w:themeShade="BF"/>
       <w:sz w:val="32"/>
       <w:szCs w:val="32"/>
     </w:rPr>
   </w:style>
-  <w:style w:type="character" w:customStyle="1" w:styleId="Heading3Char">
+  <w:style w:type="character" w:styleId="Heading3Char" w:customStyle="1">
     <w:name w:val="Heading 3 Char"/>
     <w:basedOn w:val="DefaultParagraphFont"/>
     <w:link w:val="Heading3"/>
@@ -11507,7 +11850,7 @@
       <w:szCs w:val="28"/>
     </w:rPr>
   </w:style>
-  <w:style w:type="character" w:customStyle="1" w:styleId="Heading4Char">
+  <w:style w:type="character" w:styleId="Heading4Char" w:customStyle="1">
     <w:name w:val="Heading 4 Char"/>
     <w:basedOn w:val="DefaultParagraphFont"/>
     <w:link w:val="Heading4"/>
@@ -11520,7 +11863,7 @@
       <w:color w:val="0F4761" w:themeColor="accent1" w:themeShade="BF"/>
     </w:rPr>
   </w:style>
-  <w:style w:type="character" w:customStyle="1" w:styleId="Heading5Char">
+  <w:style w:type="character" w:styleId="Heading5Char" w:customStyle="1">
     <w:name w:val="Heading 5 Char"/>
     <w:basedOn w:val="DefaultParagraphFont"/>
     <w:link w:val="Heading5"/>
@@ -11531,7 +11874,7 @@
       <w:color w:val="0F4761" w:themeColor="accent1" w:themeShade="BF"/>
     </w:rPr>
   </w:style>
-  <w:style w:type="character" w:customStyle="1" w:styleId="Heading6Char">
+  <w:style w:type="character" w:styleId="Heading6Char" w:customStyle="1">
     <w:name w:val="Heading 6 Char"/>
     <w:basedOn w:val="DefaultParagraphFont"/>
     <w:link w:val="Heading6"/>
@@ -11545,7 +11888,7 @@
       <w:color w:val="595959" w:themeColor="text1" w:themeTint="A6"/>
     </w:rPr>
   </w:style>
-  <w:style w:type="character" w:customStyle="1" w:styleId="Heading7Char">
+  <w:style w:type="character" w:styleId="Heading7Char" w:customStyle="1">
     <w:name w:val="Heading 7 Char"/>
     <w:basedOn w:val="DefaultParagraphFont"/>
     <w:link w:val="Heading7"/>
@@ -11557,7 +11900,7 @@
       <w:color w:val="595959" w:themeColor="text1" w:themeTint="A6"/>
     </w:rPr>
   </w:style>
-  <w:style w:type="character" w:customStyle="1" w:styleId="Heading8Char">
+  <w:style w:type="character" w:styleId="Heading8Char" w:customStyle="1">
     <w:name w:val="Heading 8 Char"/>
     <w:basedOn w:val="DefaultParagraphFont"/>
     <w:link w:val="Heading8"/>
@@ -11571,7 +11914,7 @@
       <w:color w:val="272727" w:themeColor="text1" w:themeTint="D8"/>
     </w:rPr>
   </w:style>
-  <w:style w:type="character" w:customStyle="1" w:styleId="Heading9Char">
+  <w:style w:type="character" w:styleId="Heading9Char" w:customStyle="1">
     <w:name w:val="Heading 9 Char"/>
     <w:basedOn w:val="DefaultParagraphFont"/>
     <w:link w:val="Heading9"/>
@@ -11596,21 +11939,21 @@
       <w:contextualSpacing/>
     </w:pPr>
     <w:rPr>
-      <w:rFonts w:asciiTheme="majorHAnsi" w:eastAsiaTheme="majorEastAsia" w:hAnsiTheme="majorHAnsi" w:cstheme="majorBidi"/>
+      <w:rFonts w:asciiTheme="majorHAnsi" w:hAnsiTheme="majorHAnsi" w:eastAsiaTheme="majorEastAsia" w:cstheme="majorBidi"/>
       <w:spacing w:val="-10"/>
       <w:kern w:val="28"/>
       <w:sz w:val="56"/>
       <w:szCs w:val="56"/>
     </w:rPr>
   </w:style>
-  <w:style w:type="character" w:customStyle="1" w:styleId="TitleChar">
+  <w:style w:type="character" w:styleId="TitleChar" w:customStyle="1">
     <w:name w:val="Title Char"/>
     <w:basedOn w:val="DefaultParagraphFont"/>
     <w:link w:val="Title"/>
     <w:uiPriority w:val="10"/>
     <w:rsid w:val="00590662"/>
     <w:rPr>
-      <w:rFonts w:asciiTheme="majorHAnsi" w:eastAsiaTheme="majorEastAsia" w:hAnsiTheme="majorHAnsi" w:cstheme="majorBidi"/>
+      <w:rFonts w:asciiTheme="majorHAnsi" w:hAnsiTheme="majorHAnsi" w:eastAsiaTheme="majorEastAsia" w:cstheme="majorBidi"/>
       <w:spacing w:val="-10"/>
       <w:kern w:val="28"/>
       <w:sz w:val="56"/>
@@ -11638,7 +11981,7 @@
       <w:szCs w:val="28"/>
     </w:rPr>
   </w:style>
-  <w:style w:type="character" w:customStyle="1" w:styleId="SubtitleChar">
+  <w:style w:type="character" w:styleId="SubtitleChar" w:customStyle="1">
     <w:name w:val="Subtitle Char"/>
     <w:basedOn w:val="DefaultParagraphFont"/>
     <w:link w:val="Subtitle"/>
@@ -11670,7 +12013,7 @@
       <w:color w:val="404040" w:themeColor="text1" w:themeTint="BF"/>
     </w:rPr>
   </w:style>
-  <w:style w:type="character" w:customStyle="1" w:styleId="QuoteChar">
+  <w:style w:type="character" w:styleId="QuoteChar" w:customStyle="1">
     <w:name w:val="Quote Char"/>
     <w:basedOn w:val="DefaultParagraphFont"/>
     <w:link w:val="Quote"/>
@@ -11715,8 +12058,8 @@
     <w:rsid w:val="00590662"/>
     <w:pPr>
       <w:pBdr>
-        <w:top w:val="single" w:sz="4" w:space="10" w:color="0F4761" w:themeColor="accent1" w:themeShade="BF"/>
-        <w:bottom w:val="single" w:sz="4" w:space="10" w:color="0F4761" w:themeColor="accent1" w:themeShade="BF"/>
+        <w:top w:val="single" w:color="0F4761" w:themeColor="accent1" w:themeShade="BF" w:sz="4" w:space="10"/>
+        <w:bottom w:val="single" w:color="0F4761" w:themeColor="accent1" w:themeShade="BF" w:sz="4" w:space="10"/>
       </w:pBdr>
       <w:spacing w:before="360" w:after="360"/>
       <w:ind w:left="864" w:right="864"/>
@@ -11728,7 +12071,7 @@
       <w:color w:val="0F4761" w:themeColor="accent1" w:themeShade="BF"/>
     </w:rPr>
   </w:style>
-  <w:style w:type="character" w:customStyle="1" w:styleId="IntenseQuoteChar">
+  <w:style w:type="character" w:styleId="IntenseQuoteChar" w:customStyle="1">
     <w:name w:val="Intense Quote Char"/>
     <w:basedOn w:val="DefaultParagraphFont"/>
     <w:link w:val="IntenseQuote"/>
@@ -11772,7 +12115,7 @@
       <w14:ligatures w14:val="none"/>
     </w:rPr>
   </w:style>
-  <w:style w:type="character" w:customStyle="1" w:styleId="NoSpacingChar">
+  <w:style w:type="character" w:styleId="NoSpacingChar" w:customStyle="1">
     <w:name w:val="No Spacing Char"/>
     <w:basedOn w:val="DefaultParagraphFont"/>
     <w:link w:val="NoSpacing"/>
@@ -11817,12 +12160,12 @@
     </w:pPr>
     <w:tblPr>
       <w:tblBorders>
-        <w:top w:val="single" w:sz="4" w:space="0" w:color="auto"/>
-        <w:left w:val="single" w:sz="4" w:space="0" w:color="auto"/>
-        <w:bottom w:val="single" w:sz="4" w:space="0" w:color="auto"/>
-        <w:right w:val="single" w:sz="4" w:space="0" w:color="auto"/>
-        <w:insideH w:val="single" w:sz="4" w:space="0" w:color="auto"/>
-        <w:insideV w:val="single" w:sz="4" w:space="0" w:color="auto"/>
+        <w:top w:val="single" w:color="auto" w:sz="4" w:space="0"/>
+        <w:left w:val="single" w:color="auto" w:sz="4" w:space="0"/>
+        <w:bottom w:val="single" w:color="auto" w:sz="4" w:space="0"/>
+        <w:right w:val="single" w:color="auto" w:sz="4" w:space="0"/>
+        <w:insideH w:val="single" w:color="auto" w:sz="4" w:space="0"/>
+        <w:insideV w:val="single" w:color="auto" w:sz="4" w:space="0"/>
       </w:tblBorders>
     </w:tblPr>
   </w:style>
@@ -11879,7 +12222,7 @@
 </file>
 
 <file path=word/theme/theme1.xml><?xml version="1.0" encoding="utf-8"?>
-<a:theme xmlns:a="http://schemas.openxmlformats.org/drawingml/2006/main" name="Office Theme">
+<a:theme xmlns:a="http://schemas.openxmlformats.org/drawingml/2006/main" xmlns:thm15="http://schemas.microsoft.com/office/thememl/2012/main" name="Office Theme">
   <a:themeElements>
     <a:clrScheme name="Office">
       <a:dk1>
@@ -12208,6 +12551,179 @@
 <b:Sources xmlns:b="http://schemas.openxmlformats.org/officeDocument/2006/bibliography" xmlns="http://schemas.openxmlformats.org/officeDocument/2006/bibliography" SelectedStyle="\HarvardAnglia2008OfficeOnline.xsl" StyleName="Harvard - Anglia" Version="2008"/>
 </file>
 
+<file path=customXml/item3.xml><?xml version="1.0" encoding="utf-8"?>
+<ct:contentTypeSchema xmlns:ct="http://schemas.microsoft.com/office/2006/metadata/contentType" xmlns:ma="http://schemas.microsoft.com/office/2006/metadata/properties/metaAttributes" ct:_="" ma:_="" ma:contentTypeName="Document" ma:contentTypeID="0x010100F5B2C1B8C9F4814DAA254D8D25884884" ma:contentTypeVersion="6" ma:contentTypeDescription="Create a new document." ma:contentTypeScope="" ma:versionID="d028e446b4282a64f5a033bc3368c4a5">
+  <xsd:schema xmlns:xsd="http://www.w3.org/2001/XMLSchema" xmlns:xs="http://www.w3.org/2001/XMLSchema" xmlns:p="http://schemas.microsoft.com/office/2006/metadata/properties" xmlns:ns3="29bd607c-1531-4b85-a3df-fd4cbba09f6b" targetNamespace="http://schemas.microsoft.com/office/2006/metadata/properties" ma:root="true" ma:fieldsID="d4c469a0923a56d7710024bd550c9989" ns3:_="">
+    <xsd:import namespace="29bd607c-1531-4b85-a3df-fd4cbba09f6b"/>
+    <xsd:element name="properties">
+      <xsd:complexType>
+        <xsd:sequence>
+          <xsd:element name="documentManagement">
+            <xsd:complexType>
+              <xsd:all>
+                <xsd:element ref="ns3:MediaServiceDateTaken" minOccurs="0"/>
+                <xsd:element ref="ns3:MediaServiceMetadata" minOccurs="0"/>
+                <xsd:element ref="ns3:MediaServiceFastMetadata" minOccurs="0"/>
+                <xsd:element ref="ns3:MediaServiceSearchProperties" minOccurs="0"/>
+                <xsd:element ref="ns3:MediaServiceObjectDetectorVersions" minOccurs="0"/>
+                <xsd:element ref="ns3:_activity" minOccurs="0"/>
+              </xsd:all>
+            </xsd:complexType>
+          </xsd:element>
+        </xsd:sequence>
+      </xsd:complexType>
+    </xsd:element>
+  </xsd:schema>
+  <xsd:schema xmlns:xsd="http://www.w3.org/2001/XMLSchema" xmlns:xs="http://www.w3.org/2001/XMLSchema" xmlns:dms="http://schemas.microsoft.com/office/2006/documentManagement/types" xmlns:pc="http://schemas.microsoft.com/office/infopath/2007/PartnerControls" targetNamespace="29bd607c-1531-4b85-a3df-fd4cbba09f6b" elementFormDefault="qualified">
+    <xsd:import namespace="http://schemas.microsoft.com/office/2006/documentManagement/types"/>
+    <xsd:import namespace="http://schemas.microsoft.com/office/infopath/2007/PartnerControls"/>
+    <xsd:element name="MediaServiceDateTaken" ma:index="8" nillable="true" ma:displayName="MediaServiceDateTaken" ma:hidden="true" ma:indexed="true" ma:internalName="MediaServiceDateTaken" ma:readOnly="true">
+      <xsd:simpleType>
+        <xsd:restriction base="dms:Text"/>
+      </xsd:simpleType>
+    </xsd:element>
+    <xsd:element name="MediaServiceMetadata" ma:index="9" nillable="true" ma:displayName="MediaServiceMetadata" ma:hidden="true" ma:internalName="MediaServiceMetadata" ma:readOnly="true">
+      <xsd:simpleType>
+        <xsd:restriction base="dms:Note"/>
+      </xsd:simpleType>
+    </xsd:element>
+    <xsd:element name="MediaServiceFastMetadata" ma:index="10" nillable="true" ma:displayName="MediaServiceFastMetadata" ma:hidden="true" ma:internalName="MediaServiceFastMetadata" ma:readOnly="true">
+      <xsd:simpleType>
+        <xsd:restriction base="dms:Note"/>
+      </xsd:simpleType>
+    </xsd:element>
+    <xsd:element name="MediaServiceSearchProperties" ma:index="11" nillable="true" ma:displayName="MediaServiceSearchProperties" ma:hidden="true" ma:internalName="MediaServiceSearchProperties" ma:readOnly="true">
+      <xsd:simpleType>
+        <xsd:restriction base="dms:Note"/>
+      </xsd:simpleType>
+    </xsd:element>
+    <xsd:element name="MediaServiceObjectDetectorVersions" ma:index="12" nillable="true" ma:displayName="MediaServiceObjectDetectorVersions" ma:hidden="true" ma:indexed="true" ma:internalName="MediaServiceObjectDetectorVersions" ma:readOnly="true">
+      <xsd:simpleType>
+        <xsd:restriction base="dms:Text"/>
+      </xsd:simpleType>
+    </xsd:element>
+    <xsd:element name="_activity" ma:index="13" nillable="true" ma:displayName="_activity" ma:hidden="true" ma:internalName="_activity">
+      <xsd:simpleType>
+        <xsd:restriction base="dms:Note"/>
+      </xsd:simpleType>
+    </xsd:element>
+  </xsd:schema>
+  <xsd:schema xmlns="http://schemas.openxmlformats.org/package/2006/metadata/core-properties" xmlns:xsd="http://www.w3.org/2001/XMLSchema" xmlns:xsi="http://www.w3.org/2001/XMLSchema-instance" xmlns:dc="http://purl.org/dc/elements/1.1/" xmlns:dcterms="http://purl.org/dc/terms/" xmlns:odoc="http://schemas.microsoft.com/internal/obd" targetNamespace="http://schemas.openxmlformats.org/package/2006/metadata/core-properties" elementFormDefault="qualified" attributeFormDefault="unqualified" blockDefault="#all">
+    <xsd:import namespace="http://purl.org/dc/elements/1.1/" schemaLocation="http://dublincore.org/schemas/xmls/qdc/2003/04/02/dc.xsd"/>
+    <xsd:import namespace="http://purl.org/dc/terms/" schemaLocation="http://dublincore.org/schemas/xmls/qdc/2003/04/02/dcterms.xsd"/>
+    <xsd:element name="coreProperties" type="CT_coreProperties"/>
+    <xsd:complexType name="CT_coreProperties">
+      <xsd:all>
+        <xsd:element ref="dc:creator" minOccurs="0" maxOccurs="1"/>
+        <xsd:element ref="dcterms:created" minOccurs="0" maxOccurs="1"/>
+        <xsd:element ref="dc:identifier" minOccurs="0" maxOccurs="1"/>
+        <xsd:element name="contentType" minOccurs="0" maxOccurs="1" type="xsd:string" ma:index="0" ma:displayName="Content Type"/>
+        <xsd:element ref="dc:title" minOccurs="0" maxOccurs="1" ma:index="4" ma:displayName="Title"/>
+        <xsd:element ref="dc:subject" minOccurs="0" maxOccurs="1"/>
+        <xsd:element ref="dc:description" minOccurs="0" maxOccurs="1"/>
+        <xsd:element name="keywords" minOccurs="0" maxOccurs="1" type="xsd:string"/>
+        <xsd:element ref="dc:language" minOccurs="0" maxOccurs="1"/>
+        <xsd:element name="category" minOccurs="0" maxOccurs="1" type="xsd:string"/>
+        <xsd:element name="version" minOccurs="0" maxOccurs="1" type="xsd:string"/>
+        <xsd:element name="revision" minOccurs="0" maxOccurs="1" type="xsd:string">
+          <xsd:annotation>
+            <xsd:documentation>
+                        This value indicates the number of saves or revisions. The application is responsible for updating this value after each revision.
+                    </xsd:documentation>
+          </xsd:annotation>
+        </xsd:element>
+        <xsd:element name="lastModifiedBy" minOccurs="0" maxOccurs="1" type="xsd:string"/>
+        <xsd:element ref="dcterms:modified" minOccurs="0" maxOccurs="1"/>
+        <xsd:element name="contentStatus" minOccurs="0" maxOccurs="1" type="xsd:string"/>
+      </xsd:all>
+    </xsd:complexType>
+  </xsd:schema>
+  <xs:schema xmlns:pc="http://schemas.microsoft.com/office/infopath/2007/PartnerControls" xmlns:xs="http://www.w3.org/2001/XMLSchema" targetNamespace="http://schemas.microsoft.com/office/infopath/2007/PartnerControls" elementFormDefault="qualified" attributeFormDefault="unqualified">
+    <xs:element name="Person">
+      <xs:complexType>
+        <xs:sequence>
+          <xs:element ref="pc:DisplayName" minOccurs="0"/>
+          <xs:element ref="pc:AccountId" minOccurs="0"/>
+          <xs:element ref="pc:AccountType" minOccurs="0"/>
+        </xs:sequence>
+      </xs:complexType>
+    </xs:element>
+    <xs:element name="DisplayName" type="xs:string"/>
+    <xs:element name="AccountId" type="xs:string"/>
+    <xs:element name="AccountType" type="xs:string"/>
+    <xs:element name="BDCAssociatedEntity">
+      <xs:complexType>
+        <xs:sequence>
+          <xs:element ref="pc:BDCEntity" minOccurs="0" maxOccurs="unbounded"/>
+        </xs:sequence>
+        <xs:attribute ref="pc:EntityNamespace"/>
+        <xs:attribute ref="pc:EntityName"/>
+        <xs:attribute ref="pc:SystemInstanceName"/>
+        <xs:attribute ref="pc:AssociationName"/>
+      </xs:complexType>
+    </xs:element>
+    <xs:attribute name="EntityNamespace" type="xs:string"/>
+    <xs:attribute name="EntityName" type="xs:string"/>
+    <xs:attribute name="SystemInstanceName" type="xs:string"/>
+    <xs:attribute name="AssociationName" type="xs:string"/>
+    <xs:element name="BDCEntity">
+      <xs:complexType>
+        <xs:sequence>
+          <xs:element ref="pc:EntityDisplayName" minOccurs="0"/>
+          <xs:element ref="pc:EntityInstanceReference" minOccurs="0"/>
+          <xs:element ref="pc:EntityId1" minOccurs="0"/>
+          <xs:element ref="pc:EntityId2" minOccurs="0"/>
+          <xs:element ref="pc:EntityId3" minOccurs="0"/>
+          <xs:element ref="pc:EntityId4" minOccurs="0"/>
+          <xs:element ref="pc:EntityId5" minOccurs="0"/>
+        </xs:sequence>
+      </xs:complexType>
+    </xs:element>
+    <xs:element name="EntityDisplayName" type="xs:string"/>
+    <xs:element name="EntityInstanceReference" type="xs:string"/>
+    <xs:element name="EntityId1" type="xs:string"/>
+    <xs:element name="EntityId2" type="xs:string"/>
+    <xs:element name="EntityId3" type="xs:string"/>
+    <xs:element name="EntityId4" type="xs:string"/>
+    <xs:element name="EntityId5" type="xs:string"/>
+    <xs:element name="Terms">
+      <xs:complexType>
+        <xs:sequence>
+          <xs:element ref="pc:TermInfo" minOccurs="0" maxOccurs="unbounded"/>
+        </xs:sequence>
+      </xs:complexType>
+    </xs:element>
+    <xs:element name="TermInfo">
+      <xs:complexType>
+        <xs:sequence>
+          <xs:element ref="pc:TermName" minOccurs="0"/>
+          <xs:element ref="pc:TermId" minOccurs="0"/>
+        </xs:sequence>
+      </xs:complexType>
+    </xs:element>
+    <xs:element name="TermName" type="xs:string"/>
+    <xs:element name="TermId" type="xs:string"/>
+  </xs:schema>
+</ct:contentTypeSchema>
+</file>
+
+<file path=customXml/item4.xml><?xml version="1.0" encoding="utf-8"?>
+<?mso-contentType ?>
+<FormTemplates xmlns="http://schemas.microsoft.com/sharepoint/v3/contenttype/forms">
+  <Display>DocumentLibraryForm</Display>
+  <Edit>DocumentLibraryForm</Edit>
+  <New>DocumentLibraryForm</New>
+</FormTemplates>
+</file>
+
+<file path=customXml/item5.xml><?xml version="1.0" encoding="utf-8"?>
+<p:properties xmlns:p="http://schemas.microsoft.com/office/2006/metadata/properties" xmlns:xsi="http://www.w3.org/2001/XMLSchema-instance" xmlns:pc="http://schemas.microsoft.com/office/infopath/2007/PartnerControls">
+  <documentManagement>
+    <_activity xmlns="29bd607c-1531-4b85-a3df-fd4cbba09f6b" xsi:nil="true"/>
+  </documentManagement>
+</p:properties>
+</file>
+
 <file path=customXml/itemProps1.xml><?xml version="1.0" encoding="utf-8"?>
 <ds:datastoreItem xmlns:ds="http://schemas.openxmlformats.org/officeDocument/2006/customXml" ds:itemID="{55AF091B-3C7A-41E3-B477-F2FDAA23CFDA}">
   <ds:schemaRefs>
@@ -12222,4 +12738,40 @@
     <ds:schemaRef ds:uri="http://schemas.openxmlformats.org/officeDocument/2006/bibliography"/>
   </ds:schemaRefs>
 </ds:datastoreItem>
+</file>
+
+<file path=customXml/itemProps3.xml><?xml version="1.0" encoding="utf-8"?>
+<ds:datastoreItem xmlns:ds="http://schemas.openxmlformats.org/officeDocument/2006/customXml" ds:itemID="{057C34D2-D92F-4D70-8F7C-7AEDF5194AD8}">
+  <ds:schemaRefs>
+    <ds:schemaRef ds:uri="http://schemas.microsoft.com/office/2006/metadata/contentType"/>
+    <ds:schemaRef ds:uri="http://schemas.microsoft.com/office/2006/metadata/properties/metaAttributes"/>
+    <ds:schemaRef ds:uri="http://www.w3.org/2001/XMLSchema"/>
+    <ds:schemaRef ds:uri="http://schemas.microsoft.com/office/2006/metadata/properties"/>
+    <ds:schemaRef ds:uri="29bd607c-1531-4b85-a3df-fd4cbba09f6b"/>
+    <ds:schemaRef ds:uri="http://schemas.microsoft.com/office/2006/documentManagement/types"/>
+    <ds:schemaRef ds:uri="http://schemas.microsoft.com/office/infopath/2007/PartnerControls"/>
+    <ds:schemaRef ds:uri="http://schemas.openxmlformats.org/package/2006/metadata/core-properties"/>
+    <ds:schemaRef ds:uri="http://purl.org/dc/elements/1.1/"/>
+    <ds:schemaRef ds:uri="http://purl.org/dc/terms/"/>
+    <ds:schemaRef ds:uri="http://schemas.microsoft.com/internal/obd"/>
+  </ds:schemaRefs>
+</ds:datastoreItem>
+</file>
+
+<file path=customXml/itemProps4.xml><?xml version="1.0" encoding="utf-8"?>
+<ds:datastoreItem xmlns:ds="http://schemas.openxmlformats.org/officeDocument/2006/customXml" ds:itemID="{00218194-15DF-411F-9A80-9A42A9D3BE7B}">
+  <ds:schemaRefs>
+    <ds:schemaRef ds:uri="http://schemas.microsoft.com/sharepoint/v3/contenttype/forms"/>
+  </ds:schemaRefs>
+</ds:datastoreItem>
+</file>
+
+<file path=customXml/itemProps5.xml><?xml version="1.0" encoding="utf-8"?>
+<ds:datastoreItem xmlns:ds="http://schemas.openxmlformats.org/officeDocument/2006/customXml" ds:itemID="{DD27383F-1617-4B87-8E0A-5AE940D4782E}">
+  <ds:schemaRefs>
+    <ds:schemaRef ds:uri="http://schemas.microsoft.com/office/2006/metadata/properties"/>
+    <ds:schemaRef ds:uri="http://schemas.microsoft.com/office/infopath/2007/PartnerControls"/>
+    <ds:schemaRef ds:uri="29bd607c-1531-4b85-a3df-fd4cbba09f6b"/>
+  </ds:schemaRefs>
+</ds:datastoreItem>
 </file>
</xml_diff>